<commit_message>
Remove monetary amounts from CV awards
</commit_message>
<xml_diff>
--- a/CV/IjayNarangCV.docx
+++ b/CV/IjayNarangCV.docx
@@ -917,7 +917,7 @@
         <w:ind w:left="360"/>
       </w:pPr>
       <w:r>
-        <w:t>Georgia Tech Presidential Fellowship ($5,000 Award)</w:t>
+        <w:t>Georgia Tech Presidential Fellowship</w:t>
       </w:r>
     </w:p>
     <w:p>
@@ -931,7 +931,7 @@
         <w:ind w:left="360"/>
       </w:pPr>
       <w:r>
-        <w:t>Computer Science Outstanding Student Teaching Award, Princeton University ($1,000 Award)</w:t>
+        <w:t>Computer Science Outstanding Student Teaching Award, Princeton University</w:t>
       </w:r>
     </w:p>
     <w:p>
@@ -945,10 +945,10 @@
         <w:ind w:left="360"/>
       </w:pPr>
       <w:r>
-        <w:t xml:space="preserve">Outstanding Computer Science Research Prize, Princeton University </w:t>
-      </w:r>
-      <w:r>
-        <w:t>($1,500 Award)</w:t>
+        <w:t xml:space="preserve">Outstanding Computer Science Research Prize, Princeton University</w:t>
+      </w:r>
+      <w:r>
+        <w:t/>
       </w:r>
     </w:p>
     <w:p>

</xml_diff>

<commit_message>
Update CV and regenerate PDF
</commit_message>
<xml_diff>
--- a/CV/IjayNarangCV.docx
+++ b/CV/IjayNarangCV.docx
@@ -94,28 +94,155 @@
         <w:rPr>
           <w:i/>
         </w:rPr>
-        <w:t>2029</w:t>
-      </w:r>
-      <w:r>
-        <w:rPr>
-          <w:rStyle w:val="FootnoteReference"/>
-          <w:i/>
-        </w:rPr>
-        <w:footnoteReference w:customMarkFollows="1" w:id="1"/>
-        <w:t>*</w:t>
-      </w:r>
-    </w:p>
-    <w:p>
-      <w:pPr>
+        <w:t>202</w:t>
+      </w:r>
+      <w:r>
+        <w:rPr>
+          <w:i/>
+        </w:rPr>
+        <w:t>9 (expected)</w:t>
+      </w:r>
+    </w:p>
+    <w:p>
+      <w:pPr>
+        <w:pStyle w:val="ListParagraph"/>
         <w:keepLines/>
-        <w:ind w:left="270" w:hanging="270"/>
-      </w:pPr>
-      <w:r>
-        <w:t>•</w:t>
+        <w:numPr>
+          <w:ilvl w:val="0"/>
+          <w:numId w:val="10"/>
+        </w:numPr>
+      </w:pPr>
+      <w:r>
+        <w:t xml:space="preserve">Ph.D. </w:t>
+      </w:r>
+      <w:r>
+        <w:t>Student</w:t>
+      </w:r>
+      <w:r>
+        <w:t xml:space="preserve"> in Computer Science</w:t>
+      </w:r>
+    </w:p>
+    <w:p>
+      <w:pPr>
+        <w:pStyle w:val="ListParagraph"/>
+        <w:numPr>
+          <w:ilvl w:val="0"/>
+          <w:numId w:val="10"/>
+        </w:numPr>
+        <w:tabs>
+          <w:tab w:val="right" w:pos="9936"/>
+        </w:tabs>
+      </w:pPr>
+      <w:r>
+        <w:t>M.S. in Machine Learning</w:t>
       </w:r>
       <w:r>
         <w:tab/>
-        <w:t>Ph.D. Candidate in Computer Science</w:t>
+      </w:r>
+      <w:r>
+        <w:t xml:space="preserve">       </w:t>
+      </w:r>
+      <w:r>
+        <w:t xml:space="preserve">                               </w:t>
+      </w:r>
+      <w:r>
+        <w:rPr>
+          <w:i/>
+        </w:rPr>
+        <w:t>2025-202</w:t>
+      </w:r>
+      <w:r>
+        <w:rPr>
+          <w:i/>
+        </w:rPr>
+        <w:t>7</w:t>
+      </w:r>
+      <w:r>
+        <w:rPr>
+          <w:i/>
+        </w:rPr>
+        <w:t xml:space="preserve"> </w:t>
+      </w:r>
+      <w:r>
+        <w:rPr>
+          <w:i/>
+        </w:rPr>
+        <w:t>(expected)</w:t>
+      </w:r>
+    </w:p>
+    <w:p>
+      <w:pPr>
+        <w:keepNext/>
+        <w:tabs>
+          <w:tab w:val="right" w:pos="9936"/>
+        </w:tabs>
+        <w:rPr>
+          <w:i/>
+        </w:rPr>
+      </w:pPr>
+      <w:r>
+        <w:rPr>
+          <w:b/>
+        </w:rPr>
+        <w:t>Princeton University | Princeton, NJ</w:t>
+      </w:r>
+      <w:r>
+        <w:t xml:space="preserve"> | GPA 3.9/4.0</w:t>
+      </w:r>
+      <w:r>
+        <w:tab/>
+      </w:r>
+      <w:r>
+        <w:rPr>
+          <w:i/>
+        </w:rPr>
+        <w:t>2021-2025</w:t>
+      </w:r>
+    </w:p>
+    <w:p>
+      <w:pPr>
+        <w:pStyle w:val="ListParagraph"/>
+        <w:keepLines/>
+        <w:numPr>
+          <w:ilvl w:val="0"/>
+          <w:numId w:val="9"/>
+        </w:numPr>
+        <w:rPr>
+          <w:i/>
+        </w:rPr>
+      </w:pPr>
+      <w:r>
+        <w:t xml:space="preserve">B.S.E. </w:t>
+      </w:r>
+      <w:r>
+        <w:t xml:space="preserve">in </w:t>
+      </w:r>
+      <w:r>
+        <w:t>Computer Science, summa cum</w:t>
+      </w:r>
+      <w:r>
+        <w:t xml:space="preserve"> laude</w:t>
+      </w:r>
+      <w:r>
+        <w:t>, with minors in A</w:t>
+      </w:r>
+      <w:r>
+        <w:t>pplied Mathematics</w:t>
+      </w:r>
+      <w:r>
+        <w:t>,</w:t>
+      </w:r>
+      <w:r>
+        <w:t xml:space="preserve"> </w:t>
+      </w:r>
+      <w:r>
+        <w:t>Finance</w:t>
+      </w:r>
+      <w:r>
+        <w:t xml:space="preserve">, and </w:t>
+      </w:r>
+      <w:r>
+        <w:t>Optimization</w:t>
       </w:r>
     </w:p>
     <w:p>
@@ -125,121 +252,11 @@
         </w:tabs>
         <w:ind w:left="270" w:hanging="270"/>
         <w:rPr>
-          <w:i/>
-        </w:rPr>
-      </w:pPr>
-      <w:r>
-        <w:t>•</w:t>
-      </w:r>
-      <w:r>
-        <w:tab/>
-        <w:t>M.S. in Machine Learning</w:t>
-      </w:r>
-      <w:r>
-        <w:tab/>
-      </w:r>
-      <w:r>
-        <w:t xml:space="preserve">       </w:t>
-      </w:r>
-      <w:r>
-        <w:rPr>
-          <w:i/>
-        </w:rPr>
-        <w:t>2025-2026</w:t>
-      </w:r>
-      <w:r>
-        <w:rPr>
-          <w:i/>
-          <w:vertAlign w:val="superscript"/>
-        </w:rPr>
-        <w:t>*</w:t>
-      </w:r>
-    </w:p>
-    <w:p>
-      <w:pPr>
-        <w:keepNext/>
-        <w:tabs>
-          <w:tab w:val="right" w:pos="9936"/>
-        </w:tabs>
-        <w:rPr>
-          <w:i/>
-        </w:rPr>
-      </w:pPr>
-      <w:r>
-        <w:rPr>
-          <w:b/>
-        </w:rPr>
-        <w:t>Princeton University | Princeton, NJ</w:t>
-      </w:r>
-      <w:r>
-        <w:t xml:space="preserve"> | GPA 3.9/4.0</w:t>
-      </w:r>
-      <w:r>
-        <w:tab/>
-      </w:r>
-      <w:r>
-        <w:rPr>
-          <w:i/>
-        </w:rPr>
-        <w:t>2021-2025</w:t>
-      </w:r>
-    </w:p>
-    <w:p>
-      <w:pPr>
-        <w:keepLines/>
-        <w:ind w:left="270" w:hanging="270"/>
-      </w:pPr>
-      <w:r>
-        <w:t>•</w:t>
-      </w:r>
-      <w:r>
-        <w:tab/>
-        <w:t>B.S.E. Computer Science, summa cum laude, with minors in Applied and Computational Mathematics, Finance, and Optimization and Quantitative Decision Science</w:t>
-      </w:r>
-    </w:p>
-    <w:p>
-      <w:pPr>
-        <w:keepNext/>
-        <w:tabs>
-          <w:tab w:val="right" w:pos="9936"/>
-        </w:tabs>
-        <w:rPr>
-          <w:i/>
-        </w:rPr>
-      </w:pPr>
-      <w:r>
-        <w:rPr>
-          <w:b/>
-        </w:rPr>
-        <w:t>Ardrey Kell High School | Charlotte, NC</w:t>
-      </w:r>
-      <w:r>
-        <w:t xml:space="preserve"> | GPA 4.0/4.0</w:t>
-      </w:r>
-      <w:r>
-        <w:tab/>
-      </w:r>
-      <w:r>
-        <w:rPr>
-          <w:i/>
-        </w:rPr>
-        <w:t>2017-2021</w:t>
-      </w:r>
-    </w:p>
-    <w:p>
-      <w:pPr>
-        <w:keepLines/>
-        <w:ind w:left="270" w:hanging="270"/>
-      </w:pPr>
-      <w:r>
-        <w:t>•</w:t>
-      </w:r>
-      <w:r>
-        <w:tab/>
-        <w:t>U.S. Presidential Scholar, four-time AIME Qualifier, two-time National Chemistry Olympiad Finalist, Valedictorian (1/814)</w:t>
-      </w:r>
-    </w:p>
-    <w:p/>
+          <w:b/>
+          <w:sz w:val="24"/>
+        </w:rPr>
+      </w:pPr>
+    </w:p>
     <w:p>
       <w:pPr>
         <w:keepNext/>
@@ -256,371 +273,32 @@
           <w:b/>
           <w:sz w:val="24"/>
         </w:rPr>
-        <w:t>EXPERIENCE</w:t>
-      </w:r>
-    </w:p>
-    <w:p>
-      <w:pPr>
-        <w:keepNext/>
-        <w:tabs>
-          <w:tab w:val="right" w:pos="9936"/>
-        </w:tabs>
-        <w:rPr>
-          <w:i/>
-        </w:rPr>
-      </w:pPr>
-      <w:r>
-        <w:rPr>
-          <w:b/>
-        </w:rPr>
-        <w:t>Princeton Vision &amp; Learning Lab</w:t>
-      </w:r>
-      <w:r>
-        <w:rPr>
-          <w:b/>
-          <w:i/>
-        </w:rPr>
-        <w:t xml:space="preserve"> | </w:t>
-      </w:r>
-      <w:r>
-        <w:rPr>
-          <w:b/>
-          <w:i/>
-        </w:rPr>
-        <w:t xml:space="preserve">Visiting Researcher                                                                                       </w:t>
-      </w:r>
-      <w:r>
-        <w:rPr>
-          <w:b/>
-          <w:i/>
-        </w:rPr>
-        <w:tab/>
-      </w:r>
-      <w:r>
-        <w:rPr>
-          <w:i/>
-        </w:rPr>
-        <w:t>Summer '26</w:t>
+        <w:t xml:space="preserve">SELECTED </w:t>
+      </w:r>
+      <w:r>
+        <w:rPr>
+          <w:b/>
+          <w:sz w:val="24"/>
+        </w:rPr>
+        <w:t>PUBLICATIONS</w:t>
+      </w:r>
+      <w:r>
+        <w:rPr>
+          <w:b/>
+          <w:sz w:val="24"/>
+        </w:rPr>
+        <w:t xml:space="preserve"> &amp; PREPRINTS</w:t>
       </w:r>
     </w:p>
     <w:p>
       <w:pPr>
         <w:keepLines/>
-        <w:ind w:left="270" w:hanging="270"/>
-      </w:pPr>
-      <w:r>
-        <w:t>•</w:t>
-      </w:r>
-      <w:r>
-        <w:tab/>
-      </w:r>
-      <w:r>
-        <w:t xml:space="preserve">Developed </w:t>
-      </w:r>
-      <w:proofErr w:type="spellStart"/>
-      <w:r>
-        <w:t>GlimpseBC</w:t>
-      </w:r>
-      <w:proofErr w:type="spellEnd"/>
-      <w:r>
-        <w:t>, which trains a policy to select sequential visual glimpses using demonstrations generated with full-image access; work submitted to ICLR.</w:t>
-      </w:r>
-    </w:p>
-    <w:p>
-      <w:pPr>
-        <w:keepNext/>
-        <w:tabs>
-          <w:tab w:val="right" w:pos="9936"/>
-        </w:tabs>
-        <w:rPr>
-          <w:i/>
-        </w:rPr>
-      </w:pPr>
-      <w:r>
-        <w:rPr>
-          <w:b/>
-        </w:rPr>
-        <w:t>Princeton University Computer Science Department</w:t>
-      </w:r>
-      <w:r>
-        <w:rPr>
-          <w:b/>
-          <w:i/>
-        </w:rPr>
-        <w:t xml:space="preserve"> | Course Developer</w:t>
-      </w:r>
-      <w:r>
-        <w:rPr>
-          <w:b/>
-          <w:i/>
-        </w:rPr>
-        <w:tab/>
-      </w:r>
-      <w:r>
-        <w:rPr>
-          <w:i/>
-        </w:rPr>
-        <w:t>Summer '25</w:t>
-      </w:r>
-    </w:p>
-    <w:p>
-      <w:pPr>
-        <w:keepLines/>
-        <w:ind w:left="270" w:hanging="270"/>
-      </w:pPr>
-      <w:r>
-        <w:t>•</w:t>
-      </w:r>
-      <w:r>
-        <w:tab/>
-        <w:t>Developed course curriculum and wrote lecture notes for Princeton's new intermediate theoretical computer science class, COS 330.</w:t>
-      </w:r>
-    </w:p>
-    <w:p>
-      <w:pPr>
-        <w:keepNext/>
-        <w:tabs>
-          <w:tab w:val="right" w:pos="9936"/>
-        </w:tabs>
-        <w:rPr>
-          <w:i/>
-        </w:rPr>
-      </w:pPr>
-      <w:r>
-        <w:rPr>
-          <w:b/>
-        </w:rPr>
-        <w:t>Capula Investment Management</w:t>
-      </w:r>
-      <w:r>
-        <w:rPr>
-          <w:b/>
-          <w:i/>
-        </w:rPr>
-        <w:t xml:space="preserve"> | Trading and Research Intern</w:t>
-      </w:r>
-      <w:r>
-        <w:rPr>
-          <w:b/>
-          <w:i/>
-        </w:rPr>
-        <w:tab/>
-      </w:r>
-      <w:r>
-        <w:rPr>
-          <w:i/>
-        </w:rPr>
-        <w:t>Summer '24</w:t>
-      </w:r>
-    </w:p>
-    <w:p>
-      <w:pPr>
-        <w:keepLines/>
-        <w:ind w:left="270" w:hanging="270"/>
-      </w:pPr>
-      <w:r>
-        <w:t>•</w:t>
-      </w:r>
-      <w:r>
-        <w:tab/>
-        <w:t>Built a monitoring system for correlations and dislocations between CDS spreads. Developed a backtester and used it to evaluate and optimize relative-value trading strategies.</w:t>
-      </w:r>
-    </w:p>
-    <w:p>
-      <w:pPr>
-        <w:keepNext/>
-        <w:tabs>
-          <w:tab w:val="right" w:pos="9936"/>
-        </w:tabs>
-        <w:rPr>
-          <w:i/>
-        </w:rPr>
-      </w:pPr>
-      <w:r>
-        <w:rPr>
-          <w:b/>
-        </w:rPr>
-        <w:t>Siemens Digital Industries</w:t>
-      </w:r>
-      <w:r>
-        <w:rPr>
-          <w:b/>
-          <w:i/>
-        </w:rPr>
-        <w:t xml:space="preserve"> | Software Development Intern</w:t>
-      </w:r>
-      <w:r>
-        <w:rPr>
-          <w:b/>
-          <w:i/>
-        </w:rPr>
-        <w:tab/>
-      </w:r>
-      <w:r>
-        <w:rPr>
-          <w:i/>
-        </w:rPr>
-        <w:t>Summers '22 and '23</w:t>
-      </w:r>
-    </w:p>
-    <w:p>
-      <w:pPr>
-        <w:keepLines/>
-        <w:ind w:left="270" w:hanging="270"/>
-      </w:pPr>
-      <w:r>
-        <w:t>•</w:t>
-      </w:r>
-      <w:r>
-        <w:tab/>
-        <w:t>Implemented frontend components displaying client policies for the Operations Insights Dashboard with React.js.</w:t>
-      </w:r>
-    </w:p>
-    <w:p>
-      <w:pPr>
-        <w:keepLines/>
-        <w:ind w:left="270" w:hanging="270"/>
-      </w:pPr>
-      <w:r>
-        <w:t>•</w:t>
-      </w:r>
-      <w:r>
-        <w:tab/>
-        <w:t>Developed an invoice generator using PostgreSQL for the Digital E-Commerce billing module.</w:t>
-      </w:r>
-    </w:p>
-    <w:p>
-      <w:pPr>
-        <w:keepNext/>
-        <w:tabs>
-          <w:tab w:val="right" w:pos="9936"/>
-        </w:tabs>
-        <w:rPr>
-          <w:i/>
-        </w:rPr>
-      </w:pPr>
-      <w:r>
-        <w:rPr>
-          <w:b/>
-        </w:rPr>
-        <w:t>Solar Operations Solutions, LLC</w:t>
-      </w:r>
-      <w:r>
-        <w:rPr>
-          <w:b/>
-          <w:i/>
-        </w:rPr>
-        <w:t xml:space="preserve"> | Machine Learning Intern</w:t>
-      </w:r>
-      <w:r>
-        <w:rPr>
-          <w:b/>
-          <w:i/>
-        </w:rPr>
-        <w:tab/>
-      </w:r>
-      <w:r>
-        <w:rPr>
-          <w:i/>
-        </w:rPr>
-        <w:t>Summer '21</w:t>
-      </w:r>
-    </w:p>
-    <w:p>
-      <w:pPr>
-        <w:keepLines/>
-        <w:ind w:left="270" w:hanging="270"/>
-      </w:pPr>
-      <w:r>
-        <w:t>•</w:t>
-      </w:r>
-      <w:r>
-        <w:tab/>
-        <w:t>Used linear time-series models to forecast energy demand and regulate supply across solar sites.</w:t>
-      </w:r>
-    </w:p>
-    <w:p/>
-    <w:p>
-      <w:pPr>
-        <w:keepNext/>
-        <w:pBdr>
-          <w:bottom w:val="single" w:sz="4" w:space="0" w:color="000000"/>
-        </w:pBdr>
-        <w:rPr>
-          <w:b/>
-          <w:sz w:val="24"/>
-        </w:rPr>
-      </w:pPr>
-      <w:r>
-        <w:rPr>
-          <w:b/>
-          <w:sz w:val="24"/>
-        </w:rPr>
-        <w:t>SELECTED WORK</w:t>
-      </w:r>
-    </w:p>
-    <w:p>
-      <w:pPr>
-        <w:keepLines/>
-      </w:pPr>
-      <w:r>
-        <w:rPr>
-          <w:i/>
-        </w:rPr>
-        <w:t>(</w:t>
-      </w:r>
-      <w:r>
-        <w:rPr>
-          <w:i/>
-        </w:rPr>
-        <w:t xml:space="preserve">In Submission to </w:t>
-      </w:r>
-      <w:r>
-        <w:rPr>
-          <w:i/>
-        </w:rPr>
-        <w:t>ICLR</w:t>
-      </w:r>
-      <w:r>
-        <w:rPr>
-          <w:i/>
-        </w:rPr>
-        <w:t>’27</w:t>
-      </w:r>
-      <w:r>
-        <w:rPr>
-          <w:i/>
-        </w:rPr>
-        <w:t xml:space="preserve">) </w:t>
-      </w:r>
-      <w:proofErr w:type="spellStart"/>
-      <w:r>
-        <w:rPr>
-          <w:b/>
-        </w:rPr>
-        <w:t>GlimpseBC</w:t>
-      </w:r>
-      <w:proofErr w:type="spellEnd"/>
-      <w:r>
-        <w:rPr>
-          <w:b/>
-        </w:rPr>
-        <w:t>: Learning Saccadic Visual Policies from Global View Demonstrations</w:t>
-      </w:r>
-      <w:r>
-        <w:t xml:space="preserve"> (with Jia Deng)</w:t>
-      </w:r>
-    </w:p>
-    <w:p/>
-    <w:p>
-      <w:pPr>
-        <w:keepLines/>
-      </w:pPr>
-      <w:r>
-        <w:rPr>
-          <w:i/>
-        </w:rPr>
-        <w:t xml:space="preserve">(ICML '26) </w:t>
+      </w:pPr>
+      <w:r>
+        <w:rPr>
+          <w:i/>
+        </w:rPr>
+        <w:t xml:space="preserve">(ICML 2026) </w:t>
       </w:r>
       <w:r>
         <w:rPr>
@@ -663,7 +341,7 @@
         <w:rPr>
           <w:i/>
         </w:rPr>
-        <w:t xml:space="preserve">(SODA '27) </w:t>
+        <w:t xml:space="preserve">(SODA 2027) </w:t>
       </w:r>
       <w:r>
         <w:rPr>
@@ -696,28 +374,41 @@
         <w:rPr>
           <w:i/>
         </w:rPr>
-        <w:t>(In Submission to ALT</w:t>
-      </w:r>
-      <w:r>
-        <w:rPr>
-          <w:i/>
-        </w:rPr>
-        <w:t>’27</w:t>
-      </w:r>
-      <w:r>
-        <w:rPr>
-          <w:i/>
-        </w:rPr>
-        <w:t xml:space="preserve">) </w:t>
-      </w:r>
-      <w:r>
-        <w:rPr>
-          <w:b/>
-        </w:rPr>
-        <w:t>Optimal Detection of Planted Stars via a Random Energy Model</w:t>
-      </w:r>
-      <w:r>
-        <w:t xml:space="preserve"> (with Will Perkins and Timothy Wee) </w:t>
+        <w:t xml:space="preserve">(Submitted to ICLR 2027) </w:t>
+      </w:r>
+      <w:r>
+        <w:rPr>
+          <w:b/>
+        </w:rPr>
+        <w:t>GlimpseBC: Learning Saccadic Visual Policies from Global View Demonstrations</w:t>
+      </w:r>
+      <w:r>
+        <w:t xml:space="preserve"> (with Jia Deng)</w:t>
+      </w:r>
+    </w:p>
+    <w:p>
+      <w:pPr>
+        <w:keepLines/>
+      </w:pPr>
+    </w:p>
+    <w:p>
+      <w:pPr>
+        <w:keepLines/>
+      </w:pPr>
+      <w:r>
+        <w:rPr>
+          <w:i/>
+        </w:rPr>
+        <w:t xml:space="preserve">(Submitted to CPC) </w:t>
+      </w:r>
+      <w:r>
+        <w:rPr>
+          <w:b/>
+        </w:rPr>
+        <w:t>Structural Corrections to the Bethe Approximation of the Permanent</w:t>
+      </w:r>
+      <w:r>
+        <w:t xml:space="preserve"> (with Will Perkins) </w:t>
       </w:r>
       <w:hyperlink r:id="rId11" w:history="1">
         <w:r>
@@ -728,25 +419,29 @@
         </w:r>
       </w:hyperlink>
     </w:p>
-    <w:p/>
     <w:p>
       <w:pPr>
         <w:keepLines/>
       </w:pPr>
-      <w:r>
-        <w:rPr>
-          <w:i/>
-        </w:rPr>
-        <w:t xml:space="preserve">(In submission to SICON) </w:t>
-      </w:r>
-      <w:r>
-        <w:rPr>
-          <w:b/>
-        </w:rPr>
-        <w:t>Complexity of Output Feedback Stabilization</w:t>
-      </w:r>
-      <w:r>
-        <w:t xml:space="preserve"> (with Amir Ali Ahmadi, Abraar Chaudhry, and Yukai Tang) </w:t>
+    </w:p>
+    <w:p>
+      <w:pPr>
+        <w:keepLines/>
+      </w:pPr>
+      <w:r>
+        <w:rPr>
+          <w:i/>
+        </w:rPr>
+        <w:t xml:space="preserve">(Submitted to ALT 2027) </w:t>
+      </w:r>
+      <w:r>
+        <w:rPr>
+          <w:b/>
+        </w:rPr>
+        <w:t>Optimal Detection of Planted Stars via a Random Energy Model</w:t>
+      </w:r>
+      <w:r>
+        <w:t xml:space="preserve"> (with Will Perkins and Timothy Wee) </w:t>
       </w:r>
       <w:hyperlink r:id="rId12" w:history="1">
         <w:r>
@@ -772,10 +467,18 @@
         <w:rPr>
           <w:b/>
         </w:rPr>
-        <w:t>Improved SDP Coloring of 3-Colorable Graphs from Recursive Gaussian Certificates</w:t>
-      </w:r>
-      <w:r>
-        <w:t xml:space="preserve"> (with Yukai Tang) </w:t>
+        <w:t xml:space="preserve">The Hard-Core Model on Bipartite Spectral Expanders: Counting and Sampling at All </w:t>
+      </w:r>
+      <w:proofErr w:type="spellStart"/>
+      <w:r>
+        <w:rPr>
+          <w:b/>
+        </w:rPr>
+        <w:t>Fugacities</w:t>
+      </w:r>
+      <w:proofErr w:type="spellEnd"/>
+      <w:r>
+        <w:t xml:space="preserve"> (with Will Perkins) </w:t>
       </w:r>
       <w:hyperlink r:id="rId13" w:history="1">
         <w:r>
@@ -786,105 +489,327 @@
         </w:r>
       </w:hyperlink>
     </w:p>
-    <w:p/>
-    <w:p>
-      <w:pPr>
+    <w:p>
+      <w:pPr>
+        <w:keepNext/>
+        <w:pBdr>
+          <w:bottom w:val="single" w:sz="4" w:space="0" w:color="000000"/>
+        </w:pBdr>
+        <w:rPr>
+          <w:b/>
+          <w:sz w:val="24"/>
+        </w:rPr>
+      </w:pPr>
+    </w:p>
+    <w:p>
+      <w:pPr>
+        <w:keepNext/>
+        <w:pBdr>
+          <w:bottom w:val="single" w:sz="4" w:space="0" w:color="000000"/>
+        </w:pBdr>
+        <w:rPr>
+          <w:b/>
+          <w:sz w:val="24"/>
+        </w:rPr>
+      </w:pPr>
+      <w:r>
+        <w:rPr>
+          <w:b/>
+          <w:sz w:val="24"/>
+        </w:rPr>
+        <w:t xml:space="preserve">WORK </w:t>
+      </w:r>
+      <w:r>
+        <w:rPr>
+          <w:b/>
+          <w:sz w:val="24"/>
+        </w:rPr>
+        <w:t>EXPERIENCE</w:t>
+      </w:r>
+    </w:p>
+    <w:p>
+      <w:pPr>
+        <w:keepNext/>
+        <w:tabs>
+          <w:tab w:val="right" w:pos="9936"/>
+        </w:tabs>
+        <w:rPr>
+          <w:i/>
+        </w:rPr>
+      </w:pPr>
+      <w:r>
+        <w:rPr>
+          <w:b/>
+        </w:rPr>
+        <w:t>Princeton Vision &amp; Learning Lab</w:t>
+      </w:r>
+      <w:r>
+        <w:rPr>
+          <w:b/>
+          <w:i/>
+        </w:rPr>
+        <w:t xml:space="preserve"> | </w:t>
+      </w:r>
+      <w:r>
+        <w:rPr>
+          <w:b/>
+          <w:i/>
+        </w:rPr>
+        <w:t xml:space="preserve">Visiting Researcher                                                                                    </w:t>
+      </w:r>
+      <w:r>
+        <w:rPr>
+          <w:i/>
+        </w:rPr>
+        <w:t xml:space="preserve">Summer </w:t>
+      </w:r>
+      <w:r>
+        <w:rPr>
+          <w:i/>
+        </w:rPr>
+        <w:t>20</w:t>
+      </w:r>
+      <w:r>
+        <w:rPr>
+          <w:i/>
+        </w:rPr>
+        <w:t>26</w:t>
+      </w:r>
+    </w:p>
+    <w:p>
+      <w:pPr>
+        <w:pStyle w:val="ListParagraph"/>
         <w:keepLines/>
-      </w:pPr>
-      <w:r>
-        <w:rPr>
-          <w:i/>
-        </w:rPr>
-        <w:t xml:space="preserve">(Preprint) </w:t>
-      </w:r>
-      <w:r>
-        <w:rPr>
-          <w:b/>
-        </w:rPr>
-        <w:t>Structural Corrections to the Bethe Approximation of the Permanent</w:t>
-      </w:r>
-      <w:r>
-        <w:t xml:space="preserve"> (with Will Perkins) </w:t>
-      </w:r>
-      <w:hyperlink r:id="rId14" w:history="1">
-        <w:r>
-          <w:rPr>
-            <w:rStyle w:val="Hyperlink"/>
-          </w:rPr>
-          <w:t>[View Paper Here]</w:t>
-        </w:r>
-      </w:hyperlink>
-    </w:p>
-    <w:p/>
-    <w:p>
-      <w:pPr>
+        <w:numPr>
+          <w:ilvl w:val="0"/>
+          <w:numId w:val="10"/>
+        </w:numPr>
+      </w:pPr>
+      <w:r>
+        <w:t>Developed GlimpseBC, a behavioral cloning algorithm that learns saccadic visual policies from full-frame demonstrations under inference-time visual constraints. The resulting policies achieve competitive performance with full-frame baselines on RoboMimic and Push-T while substantially reducing computational cost.</w:t>
+      </w:r>
+    </w:p>
+    <w:p>
+      <w:pPr>
+        <w:keepNext/>
+        <w:tabs>
+          <w:tab w:val="right" w:pos="9936"/>
+        </w:tabs>
+        <w:rPr>
+          <w:i/>
+        </w:rPr>
+      </w:pPr>
+      <w:r>
+        <w:rPr>
+          <w:b/>
+        </w:rPr>
+        <w:t>Capula Investment Management</w:t>
+      </w:r>
+      <w:r>
+        <w:rPr>
+          <w:b/>
+          <w:i/>
+        </w:rPr>
+        <w:t xml:space="preserve"> | Trading and Research Intern</w:t>
+      </w:r>
+      <w:r>
+        <w:rPr>
+          <w:b/>
+          <w:i/>
+        </w:rPr>
+        <w:tab/>
+      </w:r>
+      <w:r>
+        <w:rPr>
+          <w:i/>
+        </w:rPr>
+        <w:t xml:space="preserve">Summer </w:t>
+      </w:r>
+      <w:r>
+        <w:rPr>
+          <w:i/>
+        </w:rPr>
+        <w:t>20</w:t>
+      </w:r>
+      <w:r>
+        <w:rPr>
+          <w:i/>
+        </w:rPr>
+        <w:t>24</w:t>
+      </w:r>
+    </w:p>
+    <w:p>
+      <w:pPr>
+        <w:pStyle w:val="ListParagraph"/>
         <w:keepLines/>
-      </w:pPr>
-      <w:r>
-        <w:rPr>
-          <w:i/>
-        </w:rPr>
-        <w:t xml:space="preserve">(Preprint) </w:t>
-      </w:r>
-      <w:r>
-        <w:rPr>
-          <w:b/>
-        </w:rPr>
-        <w:t xml:space="preserve">The Hard-Core Model on Bipartite Spectral Expanders: Counting and Sampling at All </w:t>
-      </w:r>
-      <w:proofErr w:type="spellStart"/>
-      <w:r>
-        <w:rPr>
-          <w:b/>
-        </w:rPr>
-        <w:t>Fugacities</w:t>
-      </w:r>
-      <w:proofErr w:type="spellEnd"/>
-      <w:r>
-        <w:t xml:space="preserve"> (with Will Perkins) </w:t>
-      </w:r>
-      <w:hyperlink r:id="rId15" w:history="1">
-        <w:r>
-          <w:rPr>
-            <w:rStyle w:val="Hyperlink"/>
-          </w:rPr>
-          <w:t>[View Paper Here]</w:t>
-        </w:r>
-      </w:hyperlink>
-    </w:p>
-    <w:p/>
-    <w:p>
-      <w:pPr>
+        <w:numPr>
+          <w:ilvl w:val="0"/>
+          <w:numId w:val="10"/>
+        </w:numPr>
+      </w:pPr>
+      <w:r>
+        <w:t>Built a monitoring system for correlations and dislocations between CDS spreads. Developed a backtester and used it to evaluate and optimize relative-value trading strategies.</w:t>
+      </w:r>
+    </w:p>
+    <w:p>
+      <w:pPr>
+        <w:keepNext/>
+        <w:tabs>
+          <w:tab w:val="right" w:pos="9936"/>
+        </w:tabs>
+        <w:rPr>
+          <w:i/>
+        </w:rPr>
+      </w:pPr>
+      <w:r>
+        <w:rPr>
+          <w:b/>
+        </w:rPr>
+        <w:t>Siemens Digital Industries</w:t>
+      </w:r>
+      <w:r>
+        <w:rPr>
+          <w:b/>
+          <w:i/>
+        </w:rPr>
+        <w:t xml:space="preserve"> | Software Development Intern</w:t>
+      </w:r>
+      <w:r>
+        <w:rPr>
+          <w:b/>
+          <w:i/>
+        </w:rPr>
+        <w:tab/>
+      </w:r>
+      <w:r>
+        <w:rPr>
+          <w:i/>
+        </w:rPr>
+        <w:t xml:space="preserve">Summers </w:t>
+      </w:r>
+      <w:r>
+        <w:rPr>
+          <w:i/>
+        </w:rPr>
+        <w:t>20</w:t>
+      </w:r>
+      <w:r>
+        <w:rPr>
+          <w:i/>
+        </w:rPr>
+        <w:t xml:space="preserve">22 and </w:t>
+      </w:r>
+      <w:r>
+        <w:rPr>
+          <w:i/>
+        </w:rPr>
+        <w:t>20</w:t>
+      </w:r>
+      <w:r>
+        <w:rPr>
+          <w:i/>
+        </w:rPr>
+        <w:t>23</w:t>
+      </w:r>
+    </w:p>
+    <w:p>
+      <w:pPr>
+        <w:pStyle w:val="ListParagraph"/>
         <w:keepLines/>
-      </w:pPr>
-      <w:r>
-        <w:rPr>
-          <w:i/>
-        </w:rPr>
-        <w:lastRenderedPageBreak/>
-        <w:t xml:space="preserve">(Preprint) </w:t>
-      </w:r>
-      <w:r>
-        <w:rPr>
-          <w:b/>
-        </w:rPr>
-        <w:t>Schrijver Number Quasi-Tensorization and Multicolor Ramsey Bounds via Robust OR Polynomials</w:t>
-      </w:r>
-      <w:r>
-        <w:t xml:space="preserve"> (with Yukai Tang) </w:t>
-      </w:r>
-      <w:hyperlink r:id="rId16" w:history="1">
-        <w:r>
-          <w:rPr>
-            <w:rStyle w:val="Hyperlink"/>
-          </w:rPr>
-          <w:t>[View Paper Here]</w:t>
-        </w:r>
-      </w:hyperlink>
-    </w:p>
-    <w:p>
-      <w:pPr>
+        <w:numPr>
+          <w:ilvl w:val="0"/>
+          <w:numId w:val="10"/>
+        </w:numPr>
+      </w:pPr>
+      <w:r>
+        <w:t>Implemented frontend components displaying client policies for the Operations Insights Dashboard with React.js.</w:t>
+      </w:r>
+    </w:p>
+    <w:p>
+      <w:pPr>
+        <w:pStyle w:val="ListParagraph"/>
         <w:keepLines/>
+        <w:numPr>
+          <w:ilvl w:val="0"/>
+          <w:numId w:val="10"/>
+        </w:numPr>
+      </w:pPr>
+      <w:r>
+        <w:t>Developed an invoice generator using PostgreSQL for the Digital E-Commerce billing module.</w:t>
+      </w:r>
+    </w:p>
+    <w:p>
+      <w:pPr>
+        <w:keepNext/>
+        <w:tabs>
+          <w:tab w:val="right" w:pos="9936"/>
+        </w:tabs>
+        <w:rPr>
+          <w:i/>
+        </w:rPr>
+      </w:pPr>
+      <w:r>
+        <w:rPr>
+          <w:b/>
+        </w:rPr>
+        <w:t>Solar Operations Solutions, LLC</w:t>
+      </w:r>
+      <w:r>
+        <w:rPr>
+          <w:b/>
+          <w:i/>
+        </w:rPr>
+        <w:t xml:space="preserve"> | Machine Learning Intern</w:t>
+      </w:r>
+      <w:r>
+        <w:rPr>
+          <w:b/>
+          <w:i/>
+        </w:rPr>
+        <w:tab/>
+      </w:r>
+      <w:r>
+        <w:rPr>
+          <w:i/>
+        </w:rPr>
+        <w:t>Summer</w:t>
+      </w:r>
+      <w:r>
+        <w:rPr>
+          <w:i/>
+        </w:rPr>
+        <w:t xml:space="preserve"> 20</w:t>
+      </w:r>
+      <w:r>
+        <w:rPr>
+          <w:i/>
+        </w:rPr>
+        <w:t>21</w:t>
+      </w:r>
+    </w:p>
+    <w:p>
+      <w:pPr>
+        <w:pStyle w:val="ListParagraph"/>
+        <w:keepLines/>
+        <w:numPr>
+          <w:ilvl w:val="0"/>
+          <w:numId w:val="10"/>
+        </w:numPr>
+      </w:pPr>
+      <w:r>
+        <w:t>Used linear time-series models to forecast energy demand and regulate supply across solar sites.</w:t>
+      </w:r>
+    </w:p>
+    <w:p>
+      <w:pPr>
+        <w:keepNext/>
+        <w:pBdr>
+          <w:bottom w:val="single" w:sz="4" w:space="0" w:color="000000"/>
+        </w:pBdr>
+        <w:rPr>
+          <w:b/>
+          <w:sz w:val="24"/>
+        </w:rPr>
       </w:pPr>
     </w:p>
     <w:p>
@@ -945,10 +870,7 @@
         <w:ind w:left="360"/>
       </w:pPr>
       <w:r>
-        <w:t xml:space="preserve">Outstanding Computer Science Research Prize, Princeton University</w:t>
-      </w:r>
-      <w:r>
-        <w:t/>
+        <w:t>Outstanding Computer Science Research Prize, Princeton University</w:t>
       </w:r>
     </w:p>
     <w:p>
@@ -979,7 +901,34 @@
         <w:t>Highest Honors, Princeton Computer Science Department</w:t>
       </w:r>
     </w:p>
-    <w:p/>
+    <w:p>
+      <w:pPr>
+        <w:pStyle w:val="ListParagraph"/>
+        <w:keepLines/>
+        <w:numPr>
+          <w:ilvl w:val="0"/>
+          <w:numId w:val="2"/>
+        </w:numPr>
+        <w:ind w:left="360"/>
+      </w:pPr>
+      <w:r>
+        <w:t>U.S. Presidential Scholar</w:t>
+      </w:r>
+      <w:r>
+        <w:t xml:space="preserve"> (</w:t>
+      </w:r>
+      <w:r>
+        <w:t>2021</w:t>
+      </w:r>
+      <w:r>
+        <w:t>)</w:t>
+      </w:r>
+    </w:p>
+    <w:p>
+      <w:pPr>
+        <w:keepLines/>
+      </w:pPr>
+    </w:p>
     <w:p>
       <w:pPr>
         <w:keepNext/>
@@ -1001,34 +950,68 @@
     </w:p>
     <w:p>
       <w:pPr>
-        <w:ind w:left="270" w:hanging="270"/>
-      </w:pPr>
-      <w:r>
-        <w:t>•</w:t>
-      </w:r>
-      <w:r>
-        <w:tab/>
-      </w:r>
-      <w:r>
-        <w:rPr>
-          <w:b/>
-        </w:rPr>
-        <w:t xml:space="preserve">Programming Languages: </w:t>
-      </w:r>
-      <w:r>
-        <w:t>Python, OCaml, R, Java, SQL, JavaScript, HTML, and CSS.</w:t>
-      </w:r>
-    </w:p>
-    <w:p>
-      <w:pPr>
-        <w:ind w:left="270" w:hanging="270"/>
-      </w:pPr>
-      <w:r>
-        <w:t>•</w:t>
-      </w:r>
-      <w:r>
-        <w:tab/>
-      </w:r>
+        <w:pStyle w:val="ListParagraph"/>
+        <w:numPr>
+          <w:ilvl w:val="0"/>
+          <w:numId w:val="10"/>
+        </w:numPr>
+      </w:pPr>
+      <w:r>
+        <w:rPr>
+          <w:b/>
+        </w:rPr>
+        <w:t>Languages</w:t>
+      </w:r>
+      <w:r>
+        <w:rPr>
+          <w:b/>
+        </w:rPr>
+        <w:t xml:space="preserve"> and </w:t>
+      </w:r>
+      <w:r>
+        <w:rPr>
+          <w:b/>
+        </w:rPr>
+        <w:t>Libraries</w:t>
+      </w:r>
+      <w:r>
+        <w:rPr>
+          <w:b/>
+        </w:rPr>
+        <w:t xml:space="preserve">: </w:t>
+      </w:r>
+      <w:r>
+        <w:t>Python, OCaml, R, Java, SQL,</w:t>
+      </w:r>
+      <w:r>
+        <w:t xml:space="preserve"> </w:t>
+      </w:r>
+      <w:proofErr w:type="spellStart"/>
+      <w:r>
+        <w:t>PyTorch</w:t>
+      </w:r>
+      <w:proofErr w:type="spellEnd"/>
+      <w:r>
+        <w:t xml:space="preserve">, NumPy, SciPy, </w:t>
+      </w:r>
+      <w:r>
+        <w:t>p</w:t>
+      </w:r>
+      <w:r>
+        <w:t>andas, and s</w:t>
+      </w:r>
+      <w:r>
+        <w:t>cikit-learn</w:t>
+      </w:r>
+    </w:p>
+    <w:p>
+      <w:pPr>
+        <w:pStyle w:val="ListParagraph"/>
+        <w:numPr>
+          <w:ilvl w:val="0"/>
+          <w:numId w:val="10"/>
+        </w:numPr>
+      </w:pPr>
       <w:r>
         <w:rPr>
           <w:b/>
@@ -1044,7 +1027,7 @@
       <w:r>
         <w:t xml:space="preserve"> all-in-one Princeton University course-planning app, now used by 700+ students and maintained by Hoagie Club as Hoagie Plan. </w:t>
       </w:r>
-      <w:hyperlink r:id="rId18" w:history="1">
+      <w:hyperlink r:id="rId14" w:history="1">
         <w:r>
           <w:rPr>
             <w:rStyle w:val="Hyperlink"/>
@@ -1055,14 +1038,12 @@
     </w:p>
     <w:p>
       <w:pPr>
-        <w:ind w:left="270" w:hanging="270"/>
-      </w:pPr>
-      <w:r>
-        <w:t>•</w:t>
-      </w:r>
-      <w:r>
-        <w:tab/>
-      </w:r>
+        <w:pStyle w:val="ListParagraph"/>
+        <w:numPr>
+          <w:ilvl w:val="0"/>
+          <w:numId w:val="10"/>
+        </w:numPr>
+      </w:pPr>
       <w:r>
         <w:rPr>
           <w:b/>
@@ -1072,11 +1053,6 @@
       <w:r>
         <w:t>Achieved a Second Category title with a peak USCF rating of 1902.</w:t>
       </w:r>
-    </w:p>
-    <w:p>
-      <w:pPr>
-        <w:ind w:left="270" w:hanging="270"/>
-      </w:pPr>
     </w:p>
     <w:sectPr>
       <w:pgSz w:w="12240" w:h="15840"/>
@@ -1123,34 +1099,273 @@
       </w:r>
     </w:p>
   </w:footnote>
-  <w:footnote w:id="1">
-    <w:p>
-      <w:pPr>
-        <w:pStyle w:val="FootnoteText"/>
-      </w:pPr>
-      <w:r>
-        <w:rPr>
-          <w:rStyle w:val="FootnoteReference"/>
-        </w:rPr>
-        <w:t>*</w:t>
-      </w:r>
-      <w:r>
-        <w:t xml:space="preserve"> </w:t>
-      </w:r>
-      <w:r>
-        <w:rPr>
-          <w:sz w:val="16"/>
-        </w:rPr>
-        <w:t xml:space="preserve"> Expected graduation dates.</w:t>
-      </w:r>
-    </w:p>
-  </w:footnote>
 </w:footnotes>
 </file>
 
 <file path=word/numbering.xml><?xml version="1.0" encoding="utf-8"?>
 <w:numbering xmlns:wpc="http://schemas.microsoft.com/office/word/2010/wordprocessingCanvas" xmlns:cx="http://schemas.microsoft.com/office/drawing/2014/chartex" xmlns:cx1="http://schemas.microsoft.com/office/drawing/2015/9/8/chartex" xmlns:cx2="http://schemas.microsoft.com/office/drawing/2015/10/21/chartex" xmlns:cx3="http://schemas.microsoft.com/office/drawing/2016/5/9/chartex" xmlns:cx4="http://schemas.microsoft.com/office/drawing/2016/5/10/chartex" xmlns:cx5="http://schemas.microsoft.com/office/drawing/2016/5/11/chartex" xmlns:cx6="http://schemas.microsoft.com/office/drawing/2016/5/12/chartex" xmlns:cx7="http://schemas.microsoft.com/office/drawing/2016/5/13/chartex" xmlns:cx8="http://schemas.microsoft.com/office/drawing/2016/5/14/chartex" xmlns:mc="http://schemas.openxmlformats.org/markup-compatibility/2006" xmlns:aink="http://schemas.microsoft.com/office/drawing/2016/ink" xmlns:am3d="http://schemas.microsoft.com/office/drawing/2017/model3d" xmlns:o="urn:schemas-microsoft-com:office:office" xmlns:oel="http://schemas.microsoft.com/office/2019/extlst" xmlns:r="http://schemas.openxmlformats.org/officeDocument/2006/relationships" xmlns:m="http://schemas.openxmlformats.org/officeDocument/2006/math" xmlns:v="urn:schemas-microsoft-com:vml" xmlns:wp14="http://schemas.microsoft.com/office/word/2010/wordprocessingDrawing" xmlns:wp="http://schemas.openxmlformats.org/drawingml/2006/wordprocessingDrawing" xmlns:w10="urn:schemas-microsoft-com:office:word" xmlns:w="http://schemas.openxmlformats.org/wordprocessingml/2006/main" xmlns:w14="http://schemas.microsoft.com/office/word/2010/wordml" xmlns:w15="http://schemas.microsoft.com/office/word/2012/wordml" xmlns:w16cex="http://schemas.microsoft.com/office/word/2018/wordml/cex" xmlns:w16cid="http://schemas.microsoft.com/office/word/2016/wordml/cid" xmlns:w16="http://schemas.microsoft.com/office/word/2018/wordml" xmlns:w16du="http://schemas.microsoft.com/office/word/2023/wordml/word16du" xmlns:w16sdtdh="http://schemas.microsoft.com/office/word/2020/wordml/sdtdatahash" xmlns:w16sdtfl="http://schemas.microsoft.com/office/word/2024/wordml/sdtformatlock" xmlns:w16se="http://schemas.microsoft.com/office/word/2015/wordml/symex" xmlns:wpg="http://schemas.microsoft.com/office/word/2010/wordprocessingGroup" xmlns:wpi="http://schemas.microsoft.com/office/word/2010/wordprocessingInk" xmlns:wne="http://schemas.microsoft.com/office/word/2006/wordml" xmlns:wps="http://schemas.microsoft.com/office/word/2010/wordprocessingShape" mc:Ignorable="w14 w15 w16se w16cid w16 w16cex w16sdtdh w16sdtfl w16du wp14">
   <w:abstractNum w:abstractNumId="0" w15:restartNumberingAfterBreak="0">
+    <w:nsid w:val="067E46C2"/>
+    <w:multiLevelType w:val="hybridMultilevel"/>
+    <w:tmpl w:val="9D7C3170"/>
+    <w:lvl w:ilvl="0" w:tplc="E00A8D5C">
+      <w:numFmt w:val="bullet"/>
+      <w:lvlText w:val="•"/>
+      <w:lvlJc w:val="left"/>
+      <w:pPr>
+        <w:ind w:left="360" w:hanging="360"/>
+      </w:pPr>
+      <w:rPr>
+        <w:rFonts w:ascii="Times New Roman" w:eastAsiaTheme="minorHAnsi" w:hAnsi="Times New Roman" w:cs="Times New Roman" w:hint="default"/>
+      </w:rPr>
+    </w:lvl>
+    <w:lvl w:ilvl="1" w:tplc="04090003" w:tentative="1">
+      <w:start w:val="1"/>
+      <w:numFmt w:val="bullet"/>
+      <w:lvlText w:val="o"/>
+      <w:lvlJc w:val="left"/>
+      <w:pPr>
+        <w:ind w:left="1440" w:hanging="360"/>
+      </w:pPr>
+      <w:rPr>
+        <w:rFonts w:ascii="Courier New" w:hAnsi="Courier New" w:cs="Courier New" w:hint="default"/>
+      </w:rPr>
+    </w:lvl>
+    <w:lvl w:ilvl="2" w:tplc="04090005" w:tentative="1">
+      <w:start w:val="1"/>
+      <w:numFmt w:val="bullet"/>
+      <w:lvlText w:val=""/>
+      <w:lvlJc w:val="left"/>
+      <w:pPr>
+        <w:ind w:left="2160" w:hanging="360"/>
+      </w:pPr>
+      <w:rPr>
+        <w:rFonts w:ascii="Wingdings" w:hAnsi="Wingdings" w:hint="default"/>
+      </w:rPr>
+    </w:lvl>
+    <w:lvl w:ilvl="3" w:tplc="04090001" w:tentative="1">
+      <w:start w:val="1"/>
+      <w:numFmt w:val="bullet"/>
+      <w:lvlText w:val=""/>
+      <w:lvlJc w:val="left"/>
+      <w:pPr>
+        <w:ind w:left="2880" w:hanging="360"/>
+      </w:pPr>
+      <w:rPr>
+        <w:rFonts w:ascii="Symbol" w:hAnsi="Symbol" w:hint="default"/>
+      </w:rPr>
+    </w:lvl>
+    <w:lvl w:ilvl="4" w:tplc="04090003" w:tentative="1">
+      <w:start w:val="1"/>
+      <w:numFmt w:val="bullet"/>
+      <w:lvlText w:val="o"/>
+      <w:lvlJc w:val="left"/>
+      <w:pPr>
+        <w:ind w:left="3600" w:hanging="360"/>
+      </w:pPr>
+      <w:rPr>
+        <w:rFonts w:ascii="Courier New" w:hAnsi="Courier New" w:cs="Courier New" w:hint="default"/>
+      </w:rPr>
+    </w:lvl>
+    <w:lvl w:ilvl="5" w:tplc="04090005" w:tentative="1">
+      <w:start w:val="1"/>
+      <w:numFmt w:val="bullet"/>
+      <w:lvlText w:val=""/>
+      <w:lvlJc w:val="left"/>
+      <w:pPr>
+        <w:ind w:left="4320" w:hanging="360"/>
+      </w:pPr>
+      <w:rPr>
+        <w:rFonts w:ascii="Wingdings" w:hAnsi="Wingdings" w:hint="default"/>
+      </w:rPr>
+    </w:lvl>
+    <w:lvl w:ilvl="6" w:tplc="04090001" w:tentative="1">
+      <w:start w:val="1"/>
+      <w:numFmt w:val="bullet"/>
+      <w:lvlText w:val=""/>
+      <w:lvlJc w:val="left"/>
+      <w:pPr>
+        <w:ind w:left="5040" w:hanging="360"/>
+      </w:pPr>
+      <w:rPr>
+        <w:rFonts w:ascii="Symbol" w:hAnsi="Symbol" w:hint="default"/>
+      </w:rPr>
+    </w:lvl>
+    <w:lvl w:ilvl="7" w:tplc="04090003" w:tentative="1">
+      <w:start w:val="1"/>
+      <w:numFmt w:val="bullet"/>
+      <w:lvlText w:val="o"/>
+      <w:lvlJc w:val="left"/>
+      <w:pPr>
+        <w:ind w:left="5760" w:hanging="360"/>
+      </w:pPr>
+      <w:rPr>
+        <w:rFonts w:ascii="Courier New" w:hAnsi="Courier New" w:cs="Courier New" w:hint="default"/>
+      </w:rPr>
+    </w:lvl>
+    <w:lvl w:ilvl="8" w:tplc="04090005" w:tentative="1">
+      <w:start w:val="1"/>
+      <w:numFmt w:val="bullet"/>
+      <w:lvlText w:val=""/>
+      <w:lvlJc w:val="left"/>
+      <w:pPr>
+        <w:ind w:left="6480" w:hanging="360"/>
+      </w:pPr>
+      <w:rPr>
+        <w:rFonts w:ascii="Wingdings" w:hAnsi="Wingdings" w:hint="default"/>
+      </w:rPr>
+    </w:lvl>
+  </w:abstractNum>
+  <w:abstractNum w:abstractNumId="1" w15:restartNumberingAfterBreak="0">
+    <w:nsid w:val="0F56087F"/>
+    <w:multiLevelType w:val="multilevel"/>
+    <w:tmpl w:val="4CAA670C"/>
+    <w:lvl w:ilvl="0">
+      <w:start w:val="1"/>
+      <w:numFmt w:val="bullet"/>
+      <w:lvlText w:val=""/>
+      <w:lvlJc w:val="left"/>
+      <w:pPr>
+        <w:tabs>
+          <w:tab w:val="num" w:pos="720"/>
+        </w:tabs>
+        <w:ind w:left="720" w:hanging="360"/>
+      </w:pPr>
+      <w:rPr>
+        <w:rFonts w:ascii="Symbol" w:hAnsi="Symbol" w:hint="default"/>
+        <w:sz w:val="20"/>
+      </w:rPr>
+    </w:lvl>
+    <w:lvl w:ilvl="1" w:tentative="1">
+      <w:start w:val="1"/>
+      <w:numFmt w:val="bullet"/>
+      <w:lvlText w:val="o"/>
+      <w:lvlJc w:val="left"/>
+      <w:pPr>
+        <w:tabs>
+          <w:tab w:val="num" w:pos="1440"/>
+        </w:tabs>
+        <w:ind w:left="1440" w:hanging="360"/>
+      </w:pPr>
+      <w:rPr>
+        <w:rFonts w:ascii="Courier New" w:hAnsi="Courier New" w:hint="default"/>
+        <w:sz w:val="20"/>
+      </w:rPr>
+    </w:lvl>
+    <w:lvl w:ilvl="2" w:tentative="1">
+      <w:start w:val="1"/>
+      <w:numFmt w:val="bullet"/>
+      <w:lvlText w:val=""/>
+      <w:lvlJc w:val="left"/>
+      <w:pPr>
+        <w:tabs>
+          <w:tab w:val="num" w:pos="2160"/>
+        </w:tabs>
+        <w:ind w:left="2160" w:hanging="360"/>
+      </w:pPr>
+      <w:rPr>
+        <w:rFonts w:ascii="Wingdings" w:hAnsi="Wingdings" w:hint="default"/>
+        <w:sz w:val="20"/>
+      </w:rPr>
+    </w:lvl>
+    <w:lvl w:ilvl="3" w:tentative="1">
+      <w:start w:val="1"/>
+      <w:numFmt w:val="bullet"/>
+      <w:lvlText w:val=""/>
+      <w:lvlJc w:val="left"/>
+      <w:pPr>
+        <w:tabs>
+          <w:tab w:val="num" w:pos="2880"/>
+        </w:tabs>
+        <w:ind w:left="2880" w:hanging="360"/>
+      </w:pPr>
+      <w:rPr>
+        <w:rFonts w:ascii="Wingdings" w:hAnsi="Wingdings" w:hint="default"/>
+        <w:sz w:val="20"/>
+      </w:rPr>
+    </w:lvl>
+    <w:lvl w:ilvl="4" w:tentative="1">
+      <w:start w:val="1"/>
+      <w:numFmt w:val="bullet"/>
+      <w:lvlText w:val=""/>
+      <w:lvlJc w:val="left"/>
+      <w:pPr>
+        <w:tabs>
+          <w:tab w:val="num" w:pos="3600"/>
+        </w:tabs>
+        <w:ind w:left="3600" w:hanging="360"/>
+      </w:pPr>
+      <w:rPr>
+        <w:rFonts w:ascii="Wingdings" w:hAnsi="Wingdings" w:hint="default"/>
+        <w:sz w:val="20"/>
+      </w:rPr>
+    </w:lvl>
+    <w:lvl w:ilvl="5" w:tentative="1">
+      <w:start w:val="1"/>
+      <w:numFmt w:val="bullet"/>
+      <w:lvlText w:val=""/>
+      <w:lvlJc w:val="left"/>
+      <w:pPr>
+        <w:tabs>
+          <w:tab w:val="num" w:pos="4320"/>
+        </w:tabs>
+        <w:ind w:left="4320" w:hanging="360"/>
+      </w:pPr>
+      <w:rPr>
+        <w:rFonts w:ascii="Wingdings" w:hAnsi="Wingdings" w:hint="default"/>
+        <w:sz w:val="20"/>
+      </w:rPr>
+    </w:lvl>
+    <w:lvl w:ilvl="6" w:tentative="1">
+      <w:start w:val="1"/>
+      <w:numFmt w:val="bullet"/>
+      <w:lvlText w:val=""/>
+      <w:lvlJc w:val="left"/>
+      <w:pPr>
+        <w:tabs>
+          <w:tab w:val="num" w:pos="5040"/>
+        </w:tabs>
+        <w:ind w:left="5040" w:hanging="360"/>
+      </w:pPr>
+      <w:rPr>
+        <w:rFonts w:ascii="Wingdings" w:hAnsi="Wingdings" w:hint="default"/>
+        <w:sz w:val="20"/>
+      </w:rPr>
+    </w:lvl>
+    <w:lvl w:ilvl="7" w:tentative="1">
+      <w:start w:val="1"/>
+      <w:numFmt w:val="bullet"/>
+      <w:lvlText w:val=""/>
+      <w:lvlJc w:val="left"/>
+      <w:pPr>
+        <w:tabs>
+          <w:tab w:val="num" w:pos="5760"/>
+        </w:tabs>
+        <w:ind w:left="5760" w:hanging="360"/>
+      </w:pPr>
+      <w:rPr>
+        <w:rFonts w:ascii="Wingdings" w:hAnsi="Wingdings" w:hint="default"/>
+        <w:sz w:val="20"/>
+      </w:rPr>
+    </w:lvl>
+    <w:lvl w:ilvl="8" w:tentative="1">
+      <w:start w:val="1"/>
+      <w:numFmt w:val="bullet"/>
+      <w:lvlText w:val=""/>
+      <w:lvlJc w:val="left"/>
+      <w:pPr>
+        <w:tabs>
+          <w:tab w:val="num" w:pos="6480"/>
+        </w:tabs>
+        <w:ind w:left="6480" w:hanging="360"/>
+      </w:pPr>
+      <w:rPr>
+        <w:rFonts w:ascii="Wingdings" w:hAnsi="Wingdings" w:hint="default"/>
+        <w:sz w:val="20"/>
+      </w:rPr>
+    </w:lvl>
+  </w:abstractNum>
+  <w:abstractNum w:abstractNumId="2" w15:restartNumberingAfterBreak="0">
     <w:nsid w:val="135B4EE3"/>
     <w:multiLevelType w:val="hybridMultilevel"/>
     <w:tmpl w:val="22BE2CC6"/>
@@ -1263,7 +1478,681 @@
       </w:rPr>
     </w:lvl>
   </w:abstractNum>
-  <w:abstractNum w:abstractNumId="1" w15:restartNumberingAfterBreak="0">
+  <w:abstractNum w:abstractNumId="3" w15:restartNumberingAfterBreak="0">
+    <w:nsid w:val="1C231496"/>
+    <w:multiLevelType w:val="hybridMultilevel"/>
+    <w:tmpl w:val="D0E6952E"/>
+    <w:lvl w:ilvl="0" w:tplc="E00A8D5C">
+      <w:numFmt w:val="bullet"/>
+      <w:lvlText w:val="•"/>
+      <w:lvlJc w:val="left"/>
+      <w:pPr>
+        <w:ind w:left="360" w:hanging="360"/>
+      </w:pPr>
+      <w:rPr>
+        <w:rFonts w:ascii="Times New Roman" w:eastAsiaTheme="minorHAnsi" w:hAnsi="Times New Roman" w:cs="Times New Roman" w:hint="default"/>
+      </w:rPr>
+    </w:lvl>
+    <w:lvl w:ilvl="1" w:tplc="04090003" w:tentative="1">
+      <w:start w:val="1"/>
+      <w:numFmt w:val="bullet"/>
+      <w:lvlText w:val="o"/>
+      <w:lvlJc w:val="left"/>
+      <w:pPr>
+        <w:ind w:left="1080" w:hanging="360"/>
+      </w:pPr>
+      <w:rPr>
+        <w:rFonts w:ascii="Courier New" w:hAnsi="Courier New" w:cs="Courier New" w:hint="default"/>
+      </w:rPr>
+    </w:lvl>
+    <w:lvl w:ilvl="2" w:tplc="04090005" w:tentative="1">
+      <w:start w:val="1"/>
+      <w:numFmt w:val="bullet"/>
+      <w:lvlText w:val=""/>
+      <w:lvlJc w:val="left"/>
+      <w:pPr>
+        <w:ind w:left="1800" w:hanging="360"/>
+      </w:pPr>
+      <w:rPr>
+        <w:rFonts w:ascii="Wingdings" w:hAnsi="Wingdings" w:hint="default"/>
+      </w:rPr>
+    </w:lvl>
+    <w:lvl w:ilvl="3" w:tplc="04090001" w:tentative="1">
+      <w:start w:val="1"/>
+      <w:numFmt w:val="bullet"/>
+      <w:lvlText w:val=""/>
+      <w:lvlJc w:val="left"/>
+      <w:pPr>
+        <w:ind w:left="2520" w:hanging="360"/>
+      </w:pPr>
+      <w:rPr>
+        <w:rFonts w:ascii="Symbol" w:hAnsi="Symbol" w:hint="default"/>
+      </w:rPr>
+    </w:lvl>
+    <w:lvl w:ilvl="4" w:tplc="04090003" w:tentative="1">
+      <w:start w:val="1"/>
+      <w:numFmt w:val="bullet"/>
+      <w:lvlText w:val="o"/>
+      <w:lvlJc w:val="left"/>
+      <w:pPr>
+        <w:ind w:left="3240" w:hanging="360"/>
+      </w:pPr>
+      <w:rPr>
+        <w:rFonts w:ascii="Courier New" w:hAnsi="Courier New" w:cs="Courier New" w:hint="default"/>
+      </w:rPr>
+    </w:lvl>
+    <w:lvl w:ilvl="5" w:tplc="04090005" w:tentative="1">
+      <w:start w:val="1"/>
+      <w:numFmt w:val="bullet"/>
+      <w:lvlText w:val=""/>
+      <w:lvlJc w:val="left"/>
+      <w:pPr>
+        <w:ind w:left="3960" w:hanging="360"/>
+      </w:pPr>
+      <w:rPr>
+        <w:rFonts w:ascii="Wingdings" w:hAnsi="Wingdings" w:hint="default"/>
+      </w:rPr>
+    </w:lvl>
+    <w:lvl w:ilvl="6" w:tplc="04090001" w:tentative="1">
+      <w:start w:val="1"/>
+      <w:numFmt w:val="bullet"/>
+      <w:lvlText w:val=""/>
+      <w:lvlJc w:val="left"/>
+      <w:pPr>
+        <w:ind w:left="4680" w:hanging="360"/>
+      </w:pPr>
+      <w:rPr>
+        <w:rFonts w:ascii="Symbol" w:hAnsi="Symbol" w:hint="default"/>
+      </w:rPr>
+    </w:lvl>
+    <w:lvl w:ilvl="7" w:tplc="04090003" w:tentative="1">
+      <w:start w:val="1"/>
+      <w:numFmt w:val="bullet"/>
+      <w:lvlText w:val="o"/>
+      <w:lvlJc w:val="left"/>
+      <w:pPr>
+        <w:ind w:left="5400" w:hanging="360"/>
+      </w:pPr>
+      <w:rPr>
+        <w:rFonts w:ascii="Courier New" w:hAnsi="Courier New" w:cs="Courier New" w:hint="default"/>
+      </w:rPr>
+    </w:lvl>
+    <w:lvl w:ilvl="8" w:tplc="04090005" w:tentative="1">
+      <w:start w:val="1"/>
+      <w:numFmt w:val="bullet"/>
+      <w:lvlText w:val=""/>
+      <w:lvlJc w:val="left"/>
+      <w:pPr>
+        <w:ind w:left="6120" w:hanging="360"/>
+      </w:pPr>
+      <w:rPr>
+        <w:rFonts w:ascii="Wingdings" w:hAnsi="Wingdings" w:hint="default"/>
+      </w:rPr>
+    </w:lvl>
+  </w:abstractNum>
+  <w:abstractNum w:abstractNumId="4" w15:restartNumberingAfterBreak="0">
+    <w:nsid w:val="1F1105F5"/>
+    <w:multiLevelType w:val="hybridMultilevel"/>
+    <w:tmpl w:val="90020600"/>
+    <w:lvl w:ilvl="0" w:tplc="E00A8D5C">
+      <w:numFmt w:val="bullet"/>
+      <w:lvlText w:val="•"/>
+      <w:lvlJc w:val="left"/>
+      <w:pPr>
+        <w:ind w:left="360" w:hanging="360"/>
+      </w:pPr>
+      <w:rPr>
+        <w:rFonts w:ascii="Times New Roman" w:eastAsiaTheme="minorHAnsi" w:hAnsi="Times New Roman" w:cs="Times New Roman" w:hint="default"/>
+      </w:rPr>
+    </w:lvl>
+    <w:lvl w:ilvl="1" w:tplc="04090003" w:tentative="1">
+      <w:start w:val="1"/>
+      <w:numFmt w:val="bullet"/>
+      <w:lvlText w:val="o"/>
+      <w:lvlJc w:val="left"/>
+      <w:pPr>
+        <w:ind w:left="1080" w:hanging="360"/>
+      </w:pPr>
+      <w:rPr>
+        <w:rFonts w:ascii="Courier New" w:hAnsi="Courier New" w:cs="Courier New" w:hint="default"/>
+      </w:rPr>
+    </w:lvl>
+    <w:lvl w:ilvl="2" w:tplc="04090005" w:tentative="1">
+      <w:start w:val="1"/>
+      <w:numFmt w:val="bullet"/>
+      <w:lvlText w:val=""/>
+      <w:lvlJc w:val="left"/>
+      <w:pPr>
+        <w:ind w:left="1800" w:hanging="360"/>
+      </w:pPr>
+      <w:rPr>
+        <w:rFonts w:ascii="Wingdings" w:hAnsi="Wingdings" w:hint="default"/>
+      </w:rPr>
+    </w:lvl>
+    <w:lvl w:ilvl="3" w:tplc="04090001" w:tentative="1">
+      <w:start w:val="1"/>
+      <w:numFmt w:val="bullet"/>
+      <w:lvlText w:val=""/>
+      <w:lvlJc w:val="left"/>
+      <w:pPr>
+        <w:ind w:left="2520" w:hanging="360"/>
+      </w:pPr>
+      <w:rPr>
+        <w:rFonts w:ascii="Symbol" w:hAnsi="Symbol" w:hint="default"/>
+      </w:rPr>
+    </w:lvl>
+    <w:lvl w:ilvl="4" w:tplc="04090003" w:tentative="1">
+      <w:start w:val="1"/>
+      <w:numFmt w:val="bullet"/>
+      <w:lvlText w:val="o"/>
+      <w:lvlJc w:val="left"/>
+      <w:pPr>
+        <w:ind w:left="3240" w:hanging="360"/>
+      </w:pPr>
+      <w:rPr>
+        <w:rFonts w:ascii="Courier New" w:hAnsi="Courier New" w:cs="Courier New" w:hint="default"/>
+      </w:rPr>
+    </w:lvl>
+    <w:lvl w:ilvl="5" w:tplc="04090005" w:tentative="1">
+      <w:start w:val="1"/>
+      <w:numFmt w:val="bullet"/>
+      <w:lvlText w:val=""/>
+      <w:lvlJc w:val="left"/>
+      <w:pPr>
+        <w:ind w:left="3960" w:hanging="360"/>
+      </w:pPr>
+      <w:rPr>
+        <w:rFonts w:ascii="Wingdings" w:hAnsi="Wingdings" w:hint="default"/>
+      </w:rPr>
+    </w:lvl>
+    <w:lvl w:ilvl="6" w:tplc="04090001" w:tentative="1">
+      <w:start w:val="1"/>
+      <w:numFmt w:val="bullet"/>
+      <w:lvlText w:val=""/>
+      <w:lvlJc w:val="left"/>
+      <w:pPr>
+        <w:ind w:left="4680" w:hanging="360"/>
+      </w:pPr>
+      <w:rPr>
+        <w:rFonts w:ascii="Symbol" w:hAnsi="Symbol" w:hint="default"/>
+      </w:rPr>
+    </w:lvl>
+    <w:lvl w:ilvl="7" w:tplc="04090003" w:tentative="1">
+      <w:start w:val="1"/>
+      <w:numFmt w:val="bullet"/>
+      <w:lvlText w:val="o"/>
+      <w:lvlJc w:val="left"/>
+      <w:pPr>
+        <w:ind w:left="5400" w:hanging="360"/>
+      </w:pPr>
+      <w:rPr>
+        <w:rFonts w:ascii="Courier New" w:hAnsi="Courier New" w:cs="Courier New" w:hint="default"/>
+      </w:rPr>
+    </w:lvl>
+    <w:lvl w:ilvl="8" w:tplc="04090005" w:tentative="1">
+      <w:start w:val="1"/>
+      <w:numFmt w:val="bullet"/>
+      <w:lvlText w:val=""/>
+      <w:lvlJc w:val="left"/>
+      <w:pPr>
+        <w:ind w:left="6120" w:hanging="360"/>
+      </w:pPr>
+      <w:rPr>
+        <w:rFonts w:ascii="Wingdings" w:hAnsi="Wingdings" w:hint="default"/>
+      </w:rPr>
+    </w:lvl>
+  </w:abstractNum>
+  <w:abstractNum w:abstractNumId="5" w15:restartNumberingAfterBreak="0">
+    <w:nsid w:val="21014F39"/>
+    <w:multiLevelType w:val="hybridMultilevel"/>
+    <w:tmpl w:val="9F423BEE"/>
+    <w:lvl w:ilvl="0" w:tplc="E00A8D5C">
+      <w:numFmt w:val="bullet"/>
+      <w:lvlText w:val="•"/>
+      <w:lvlJc w:val="left"/>
+      <w:pPr>
+        <w:ind w:left="360" w:hanging="360"/>
+      </w:pPr>
+      <w:rPr>
+        <w:rFonts w:ascii="Times New Roman" w:eastAsiaTheme="minorHAnsi" w:hAnsi="Times New Roman" w:cs="Times New Roman" w:hint="default"/>
+      </w:rPr>
+    </w:lvl>
+    <w:lvl w:ilvl="1" w:tplc="04090003" w:tentative="1">
+      <w:start w:val="1"/>
+      <w:numFmt w:val="bullet"/>
+      <w:lvlText w:val="o"/>
+      <w:lvlJc w:val="left"/>
+      <w:pPr>
+        <w:ind w:left="1080" w:hanging="360"/>
+      </w:pPr>
+      <w:rPr>
+        <w:rFonts w:ascii="Courier New" w:hAnsi="Courier New" w:cs="Courier New" w:hint="default"/>
+      </w:rPr>
+    </w:lvl>
+    <w:lvl w:ilvl="2" w:tplc="04090005" w:tentative="1">
+      <w:start w:val="1"/>
+      <w:numFmt w:val="bullet"/>
+      <w:lvlText w:val=""/>
+      <w:lvlJc w:val="left"/>
+      <w:pPr>
+        <w:ind w:left="1800" w:hanging="360"/>
+      </w:pPr>
+      <w:rPr>
+        <w:rFonts w:ascii="Wingdings" w:hAnsi="Wingdings" w:hint="default"/>
+      </w:rPr>
+    </w:lvl>
+    <w:lvl w:ilvl="3" w:tplc="04090001" w:tentative="1">
+      <w:start w:val="1"/>
+      <w:numFmt w:val="bullet"/>
+      <w:lvlText w:val=""/>
+      <w:lvlJc w:val="left"/>
+      <w:pPr>
+        <w:ind w:left="2520" w:hanging="360"/>
+      </w:pPr>
+      <w:rPr>
+        <w:rFonts w:ascii="Symbol" w:hAnsi="Symbol" w:hint="default"/>
+      </w:rPr>
+    </w:lvl>
+    <w:lvl w:ilvl="4" w:tplc="04090003" w:tentative="1">
+      <w:start w:val="1"/>
+      <w:numFmt w:val="bullet"/>
+      <w:lvlText w:val="o"/>
+      <w:lvlJc w:val="left"/>
+      <w:pPr>
+        <w:ind w:left="3240" w:hanging="360"/>
+      </w:pPr>
+      <w:rPr>
+        <w:rFonts w:ascii="Courier New" w:hAnsi="Courier New" w:cs="Courier New" w:hint="default"/>
+      </w:rPr>
+    </w:lvl>
+    <w:lvl w:ilvl="5" w:tplc="04090005" w:tentative="1">
+      <w:start w:val="1"/>
+      <w:numFmt w:val="bullet"/>
+      <w:lvlText w:val=""/>
+      <w:lvlJc w:val="left"/>
+      <w:pPr>
+        <w:ind w:left="3960" w:hanging="360"/>
+      </w:pPr>
+      <w:rPr>
+        <w:rFonts w:ascii="Wingdings" w:hAnsi="Wingdings" w:hint="default"/>
+      </w:rPr>
+    </w:lvl>
+    <w:lvl w:ilvl="6" w:tplc="04090001" w:tentative="1">
+      <w:start w:val="1"/>
+      <w:numFmt w:val="bullet"/>
+      <w:lvlText w:val=""/>
+      <w:lvlJc w:val="left"/>
+      <w:pPr>
+        <w:ind w:left="4680" w:hanging="360"/>
+      </w:pPr>
+      <w:rPr>
+        <w:rFonts w:ascii="Symbol" w:hAnsi="Symbol" w:hint="default"/>
+      </w:rPr>
+    </w:lvl>
+    <w:lvl w:ilvl="7" w:tplc="04090003" w:tentative="1">
+      <w:start w:val="1"/>
+      <w:numFmt w:val="bullet"/>
+      <w:lvlText w:val="o"/>
+      <w:lvlJc w:val="left"/>
+      <w:pPr>
+        <w:ind w:left="5400" w:hanging="360"/>
+      </w:pPr>
+      <w:rPr>
+        <w:rFonts w:ascii="Courier New" w:hAnsi="Courier New" w:cs="Courier New" w:hint="default"/>
+      </w:rPr>
+    </w:lvl>
+    <w:lvl w:ilvl="8" w:tplc="04090005" w:tentative="1">
+      <w:start w:val="1"/>
+      <w:numFmt w:val="bullet"/>
+      <w:lvlText w:val=""/>
+      <w:lvlJc w:val="left"/>
+      <w:pPr>
+        <w:ind w:left="6120" w:hanging="360"/>
+      </w:pPr>
+      <w:rPr>
+        <w:rFonts w:ascii="Wingdings" w:hAnsi="Wingdings" w:hint="default"/>
+      </w:rPr>
+    </w:lvl>
+  </w:abstractNum>
+  <w:abstractNum w:abstractNumId="6" w15:restartNumberingAfterBreak="0">
+    <w:nsid w:val="338402C3"/>
+    <w:multiLevelType w:val="hybridMultilevel"/>
+    <w:tmpl w:val="582E312E"/>
+    <w:lvl w:ilvl="0" w:tplc="E00A8D5C">
+      <w:numFmt w:val="bullet"/>
+      <w:lvlText w:val="•"/>
+      <w:lvlJc w:val="left"/>
+      <w:pPr>
+        <w:ind w:left="360" w:hanging="360"/>
+      </w:pPr>
+      <w:rPr>
+        <w:rFonts w:ascii="Times New Roman" w:eastAsiaTheme="minorHAnsi" w:hAnsi="Times New Roman" w:cs="Times New Roman" w:hint="default"/>
+      </w:rPr>
+    </w:lvl>
+    <w:lvl w:ilvl="1" w:tplc="04090003" w:tentative="1">
+      <w:start w:val="1"/>
+      <w:numFmt w:val="bullet"/>
+      <w:lvlText w:val="o"/>
+      <w:lvlJc w:val="left"/>
+      <w:pPr>
+        <w:ind w:left="1440" w:hanging="360"/>
+      </w:pPr>
+      <w:rPr>
+        <w:rFonts w:ascii="Courier New" w:hAnsi="Courier New" w:cs="Courier New" w:hint="default"/>
+      </w:rPr>
+    </w:lvl>
+    <w:lvl w:ilvl="2" w:tplc="04090005" w:tentative="1">
+      <w:start w:val="1"/>
+      <w:numFmt w:val="bullet"/>
+      <w:lvlText w:val=""/>
+      <w:lvlJc w:val="left"/>
+      <w:pPr>
+        <w:ind w:left="2160" w:hanging="360"/>
+      </w:pPr>
+      <w:rPr>
+        <w:rFonts w:ascii="Wingdings" w:hAnsi="Wingdings" w:hint="default"/>
+      </w:rPr>
+    </w:lvl>
+    <w:lvl w:ilvl="3" w:tplc="04090001" w:tentative="1">
+      <w:start w:val="1"/>
+      <w:numFmt w:val="bullet"/>
+      <w:lvlText w:val=""/>
+      <w:lvlJc w:val="left"/>
+      <w:pPr>
+        <w:ind w:left="2880" w:hanging="360"/>
+      </w:pPr>
+      <w:rPr>
+        <w:rFonts w:ascii="Symbol" w:hAnsi="Symbol" w:hint="default"/>
+      </w:rPr>
+    </w:lvl>
+    <w:lvl w:ilvl="4" w:tplc="04090003" w:tentative="1">
+      <w:start w:val="1"/>
+      <w:numFmt w:val="bullet"/>
+      <w:lvlText w:val="o"/>
+      <w:lvlJc w:val="left"/>
+      <w:pPr>
+        <w:ind w:left="3600" w:hanging="360"/>
+      </w:pPr>
+      <w:rPr>
+        <w:rFonts w:ascii="Courier New" w:hAnsi="Courier New" w:cs="Courier New" w:hint="default"/>
+      </w:rPr>
+    </w:lvl>
+    <w:lvl w:ilvl="5" w:tplc="04090005" w:tentative="1">
+      <w:start w:val="1"/>
+      <w:numFmt w:val="bullet"/>
+      <w:lvlText w:val=""/>
+      <w:lvlJc w:val="left"/>
+      <w:pPr>
+        <w:ind w:left="4320" w:hanging="360"/>
+      </w:pPr>
+      <w:rPr>
+        <w:rFonts w:ascii="Wingdings" w:hAnsi="Wingdings" w:hint="default"/>
+      </w:rPr>
+    </w:lvl>
+    <w:lvl w:ilvl="6" w:tplc="04090001" w:tentative="1">
+      <w:start w:val="1"/>
+      <w:numFmt w:val="bullet"/>
+      <w:lvlText w:val=""/>
+      <w:lvlJc w:val="left"/>
+      <w:pPr>
+        <w:ind w:left="5040" w:hanging="360"/>
+      </w:pPr>
+      <w:rPr>
+        <w:rFonts w:ascii="Symbol" w:hAnsi="Symbol" w:hint="default"/>
+      </w:rPr>
+    </w:lvl>
+    <w:lvl w:ilvl="7" w:tplc="04090003" w:tentative="1">
+      <w:start w:val="1"/>
+      <w:numFmt w:val="bullet"/>
+      <w:lvlText w:val="o"/>
+      <w:lvlJc w:val="left"/>
+      <w:pPr>
+        <w:ind w:left="5760" w:hanging="360"/>
+      </w:pPr>
+      <w:rPr>
+        <w:rFonts w:ascii="Courier New" w:hAnsi="Courier New" w:cs="Courier New" w:hint="default"/>
+      </w:rPr>
+    </w:lvl>
+    <w:lvl w:ilvl="8" w:tplc="04090005" w:tentative="1">
+      <w:start w:val="1"/>
+      <w:numFmt w:val="bullet"/>
+      <w:lvlText w:val=""/>
+      <w:lvlJc w:val="left"/>
+      <w:pPr>
+        <w:ind w:left="6480" w:hanging="360"/>
+      </w:pPr>
+      <w:rPr>
+        <w:rFonts w:ascii="Wingdings" w:hAnsi="Wingdings" w:hint="default"/>
+      </w:rPr>
+    </w:lvl>
+  </w:abstractNum>
+  <w:abstractNum w:abstractNumId="7" w15:restartNumberingAfterBreak="0">
+    <w:nsid w:val="675F7F58"/>
+    <w:multiLevelType w:val="hybridMultilevel"/>
+    <w:tmpl w:val="4E02171E"/>
+    <w:lvl w:ilvl="0" w:tplc="04090001">
+      <w:start w:val="1"/>
+      <w:numFmt w:val="bullet"/>
+      <w:lvlText w:val=""/>
+      <w:lvlJc w:val="left"/>
+      <w:pPr>
+        <w:ind w:left="720" w:hanging="360"/>
+      </w:pPr>
+      <w:rPr>
+        <w:rFonts w:ascii="Symbol" w:hAnsi="Symbol" w:hint="default"/>
+      </w:rPr>
+    </w:lvl>
+    <w:lvl w:ilvl="1" w:tplc="04090003" w:tentative="1">
+      <w:start w:val="1"/>
+      <w:numFmt w:val="bullet"/>
+      <w:lvlText w:val="o"/>
+      <w:lvlJc w:val="left"/>
+      <w:pPr>
+        <w:ind w:left="1440" w:hanging="360"/>
+      </w:pPr>
+      <w:rPr>
+        <w:rFonts w:ascii="Courier New" w:hAnsi="Courier New" w:cs="Courier New" w:hint="default"/>
+      </w:rPr>
+    </w:lvl>
+    <w:lvl w:ilvl="2" w:tplc="04090005" w:tentative="1">
+      <w:start w:val="1"/>
+      <w:numFmt w:val="bullet"/>
+      <w:lvlText w:val=""/>
+      <w:lvlJc w:val="left"/>
+      <w:pPr>
+        <w:ind w:left="2160" w:hanging="360"/>
+      </w:pPr>
+      <w:rPr>
+        <w:rFonts w:ascii="Wingdings" w:hAnsi="Wingdings" w:hint="default"/>
+      </w:rPr>
+    </w:lvl>
+    <w:lvl w:ilvl="3" w:tplc="04090001" w:tentative="1">
+      <w:start w:val="1"/>
+      <w:numFmt w:val="bullet"/>
+      <w:lvlText w:val=""/>
+      <w:lvlJc w:val="left"/>
+      <w:pPr>
+        <w:ind w:left="2880" w:hanging="360"/>
+      </w:pPr>
+      <w:rPr>
+        <w:rFonts w:ascii="Symbol" w:hAnsi="Symbol" w:hint="default"/>
+      </w:rPr>
+    </w:lvl>
+    <w:lvl w:ilvl="4" w:tplc="04090003" w:tentative="1">
+      <w:start w:val="1"/>
+      <w:numFmt w:val="bullet"/>
+      <w:lvlText w:val="o"/>
+      <w:lvlJc w:val="left"/>
+      <w:pPr>
+        <w:ind w:left="3600" w:hanging="360"/>
+      </w:pPr>
+      <w:rPr>
+        <w:rFonts w:ascii="Courier New" w:hAnsi="Courier New" w:cs="Courier New" w:hint="default"/>
+      </w:rPr>
+    </w:lvl>
+    <w:lvl w:ilvl="5" w:tplc="04090005" w:tentative="1">
+      <w:start w:val="1"/>
+      <w:numFmt w:val="bullet"/>
+      <w:lvlText w:val=""/>
+      <w:lvlJc w:val="left"/>
+      <w:pPr>
+        <w:ind w:left="4320" w:hanging="360"/>
+      </w:pPr>
+      <w:rPr>
+        <w:rFonts w:ascii="Wingdings" w:hAnsi="Wingdings" w:hint="default"/>
+      </w:rPr>
+    </w:lvl>
+    <w:lvl w:ilvl="6" w:tplc="04090001" w:tentative="1">
+      <w:start w:val="1"/>
+      <w:numFmt w:val="bullet"/>
+      <w:lvlText w:val=""/>
+      <w:lvlJc w:val="left"/>
+      <w:pPr>
+        <w:ind w:left="5040" w:hanging="360"/>
+      </w:pPr>
+      <w:rPr>
+        <w:rFonts w:ascii="Symbol" w:hAnsi="Symbol" w:hint="default"/>
+      </w:rPr>
+    </w:lvl>
+    <w:lvl w:ilvl="7" w:tplc="04090003" w:tentative="1">
+      <w:start w:val="1"/>
+      <w:numFmt w:val="bullet"/>
+      <w:lvlText w:val="o"/>
+      <w:lvlJc w:val="left"/>
+      <w:pPr>
+        <w:ind w:left="5760" w:hanging="360"/>
+      </w:pPr>
+      <w:rPr>
+        <w:rFonts w:ascii="Courier New" w:hAnsi="Courier New" w:cs="Courier New" w:hint="default"/>
+      </w:rPr>
+    </w:lvl>
+    <w:lvl w:ilvl="8" w:tplc="04090005" w:tentative="1">
+      <w:start w:val="1"/>
+      <w:numFmt w:val="bullet"/>
+      <w:lvlText w:val=""/>
+      <w:lvlJc w:val="left"/>
+      <w:pPr>
+        <w:ind w:left="6480" w:hanging="360"/>
+      </w:pPr>
+      <w:rPr>
+        <w:rFonts w:ascii="Wingdings" w:hAnsi="Wingdings" w:hint="default"/>
+      </w:rPr>
+    </w:lvl>
+  </w:abstractNum>
+  <w:abstractNum w:abstractNumId="8" w15:restartNumberingAfterBreak="0">
+    <w:nsid w:val="74065760"/>
+    <w:multiLevelType w:val="hybridMultilevel"/>
+    <w:tmpl w:val="96502456"/>
+    <w:lvl w:ilvl="0" w:tplc="04090001">
+      <w:start w:val="1"/>
+      <w:numFmt w:val="bullet"/>
+      <w:lvlText w:val=""/>
+      <w:lvlJc w:val="left"/>
+      <w:pPr>
+        <w:ind w:left="360" w:hanging="360"/>
+      </w:pPr>
+      <w:rPr>
+        <w:rFonts w:ascii="Symbol" w:hAnsi="Symbol" w:hint="default"/>
+      </w:rPr>
+    </w:lvl>
+    <w:lvl w:ilvl="1" w:tplc="04090003" w:tentative="1">
+      <w:start w:val="1"/>
+      <w:numFmt w:val="bullet"/>
+      <w:lvlText w:val="o"/>
+      <w:lvlJc w:val="left"/>
+      <w:pPr>
+        <w:ind w:left="1080" w:hanging="360"/>
+      </w:pPr>
+      <w:rPr>
+        <w:rFonts w:ascii="Courier New" w:hAnsi="Courier New" w:cs="Courier New" w:hint="default"/>
+      </w:rPr>
+    </w:lvl>
+    <w:lvl w:ilvl="2" w:tplc="04090005" w:tentative="1">
+      <w:start w:val="1"/>
+      <w:numFmt w:val="bullet"/>
+      <w:lvlText w:val=""/>
+      <w:lvlJc w:val="left"/>
+      <w:pPr>
+        <w:ind w:left="1800" w:hanging="360"/>
+      </w:pPr>
+      <w:rPr>
+        <w:rFonts w:ascii="Wingdings" w:hAnsi="Wingdings" w:hint="default"/>
+      </w:rPr>
+    </w:lvl>
+    <w:lvl w:ilvl="3" w:tplc="04090001" w:tentative="1">
+      <w:start w:val="1"/>
+      <w:numFmt w:val="bullet"/>
+      <w:lvlText w:val=""/>
+      <w:lvlJc w:val="left"/>
+      <w:pPr>
+        <w:ind w:left="2520" w:hanging="360"/>
+      </w:pPr>
+      <w:rPr>
+        <w:rFonts w:ascii="Symbol" w:hAnsi="Symbol" w:hint="default"/>
+      </w:rPr>
+    </w:lvl>
+    <w:lvl w:ilvl="4" w:tplc="04090003" w:tentative="1">
+      <w:start w:val="1"/>
+      <w:numFmt w:val="bullet"/>
+      <w:lvlText w:val="o"/>
+      <w:lvlJc w:val="left"/>
+      <w:pPr>
+        <w:ind w:left="3240" w:hanging="360"/>
+      </w:pPr>
+      <w:rPr>
+        <w:rFonts w:ascii="Courier New" w:hAnsi="Courier New" w:cs="Courier New" w:hint="default"/>
+      </w:rPr>
+    </w:lvl>
+    <w:lvl w:ilvl="5" w:tplc="04090005" w:tentative="1">
+      <w:start w:val="1"/>
+      <w:numFmt w:val="bullet"/>
+      <w:lvlText w:val=""/>
+      <w:lvlJc w:val="left"/>
+      <w:pPr>
+        <w:ind w:left="3960" w:hanging="360"/>
+      </w:pPr>
+      <w:rPr>
+        <w:rFonts w:ascii="Wingdings" w:hAnsi="Wingdings" w:hint="default"/>
+      </w:rPr>
+    </w:lvl>
+    <w:lvl w:ilvl="6" w:tplc="04090001" w:tentative="1">
+      <w:start w:val="1"/>
+      <w:numFmt w:val="bullet"/>
+      <w:lvlText w:val=""/>
+      <w:lvlJc w:val="left"/>
+      <w:pPr>
+        <w:ind w:left="4680" w:hanging="360"/>
+      </w:pPr>
+      <w:rPr>
+        <w:rFonts w:ascii="Symbol" w:hAnsi="Symbol" w:hint="default"/>
+      </w:rPr>
+    </w:lvl>
+    <w:lvl w:ilvl="7" w:tplc="04090003" w:tentative="1">
+      <w:start w:val="1"/>
+      <w:numFmt w:val="bullet"/>
+      <w:lvlText w:val="o"/>
+      <w:lvlJc w:val="left"/>
+      <w:pPr>
+        <w:ind w:left="5400" w:hanging="360"/>
+      </w:pPr>
+      <w:rPr>
+        <w:rFonts w:ascii="Courier New" w:hAnsi="Courier New" w:cs="Courier New" w:hint="default"/>
+      </w:rPr>
+    </w:lvl>
+    <w:lvl w:ilvl="8" w:tplc="04090005" w:tentative="1">
+      <w:start w:val="1"/>
+      <w:numFmt w:val="bullet"/>
+      <w:lvlText w:val=""/>
+      <w:lvlJc w:val="left"/>
+      <w:pPr>
+        <w:ind w:left="6120" w:hanging="360"/>
+      </w:pPr>
+      <w:rPr>
+        <w:rFonts w:ascii="Wingdings" w:hAnsi="Wingdings" w:hint="default"/>
+      </w:rPr>
+    </w:lvl>
+  </w:abstractNum>
+  <w:abstractNum w:abstractNumId="9" w15:restartNumberingAfterBreak="0">
     <w:nsid w:val="78924263"/>
     <w:multiLevelType w:val="hybridMultilevel"/>
     <w:tmpl w:val="F3468E58"/>
@@ -1284,7 +2173,7 @@
       <w:lvlText w:val="o"/>
       <w:lvlJc w:val="left"/>
       <w:pPr>
-        <w:ind w:left="1440" w:hanging="360"/>
+        <w:ind w:left="720" w:hanging="360"/>
       </w:pPr>
       <w:rPr>
         <w:rFonts w:ascii="Courier New" w:hAnsi="Courier New" w:cs="Courier New" w:hint="default"/>
@@ -1376,10 +2265,34 @@
     </w:lvl>
   </w:abstractNum>
   <w:num w:numId="1" w16cid:durableId="1768035956">
+    <w:abstractNumId w:val="2"/>
+  </w:num>
+  <w:num w:numId="2" w16cid:durableId="816651190">
+    <w:abstractNumId w:val="9"/>
+  </w:num>
+  <w:num w:numId="3" w16cid:durableId="611403332">
+    <w:abstractNumId w:val="8"/>
+  </w:num>
+  <w:num w:numId="4" w16cid:durableId="1057365106">
+    <w:abstractNumId w:val="5"/>
+  </w:num>
+  <w:num w:numId="5" w16cid:durableId="1278414274">
+    <w:abstractNumId w:val="1"/>
+  </w:num>
+  <w:num w:numId="6" w16cid:durableId="67115506">
     <w:abstractNumId w:val="0"/>
   </w:num>
-  <w:num w:numId="2" w16cid:durableId="816651190">
-    <w:abstractNumId w:val="1"/>
+  <w:num w:numId="7" w16cid:durableId="83457746">
+    <w:abstractNumId w:val="6"/>
+  </w:num>
+  <w:num w:numId="8" w16cid:durableId="1498879653">
+    <w:abstractNumId w:val="7"/>
+  </w:num>
+  <w:num w:numId="9" w16cid:durableId="2628376">
+    <w:abstractNumId w:val="3"/>
+  </w:num>
+  <w:num w:numId="10" w16cid:durableId="1042246466">
+    <w:abstractNumId w:val="4"/>
   </w:num>
 </w:numbering>
 </file>
@@ -1993,7 +2906,6 @@
   <w:style w:type="character" w:default="1" w:styleId="DefaultParagraphFont">
     <w:name w:val="Default Paragraph Font"/>
     <w:uiPriority w:val="1"/>
-    <w:semiHidden/>
     <w:unhideWhenUsed/>
   </w:style>
   <w:style w:type="table" w:default="1" w:styleId="TableNormal">
@@ -2368,6 +3280,17 @@
     <w:rsid w:val="00AD4A35"/>
     <w:rPr>
       <w:vertAlign w:val="superscript"/>
+    </w:rPr>
+  </w:style>
+  <w:style w:type="paragraph" w:styleId="NormalWeb">
+    <w:name w:val="Normal (Web)"/>
+    <w:basedOn w:val="Normal"/>
+    <w:uiPriority w:val="99"/>
+    <w:semiHidden/>
+    <w:unhideWhenUsed/>
+    <w:rsid w:val="001B609C"/>
+    <w:rPr>
+      <w:sz w:val="24"/>
     </w:rPr>
   </w:style>
 </w:styles>

</xml_diff>

<commit_message>
Align resume education dates and add award years
</commit_message>
<xml_diff>
--- a/CV/IjayNarangCV.docx
+++ b/CV/IjayNarangCV.docx
@@ -100,7 +100,7 @@
         <w:rPr>
           <w:i/>
         </w:rPr>
-        <w:t>9 (expected)</w:t>
+        <w:t>9</w:t>
       </w:r>
     </w:p>
     <w:p>
@@ -140,10 +140,10 @@
         <w:tab/>
       </w:r>
       <w:r>
-        <w:t xml:space="preserve">       </w:t>
-      </w:r>
-      <w:r>
-        <w:t xml:space="preserve">                               </w:t>
+        <w:t xml:space="preserve"/>
+      </w:r>
+      <w:r>
+        <w:t xml:space="preserve"/>
       </w:r>
       <w:r>
         <w:rPr>
@@ -161,13 +161,13 @@
         <w:rPr>
           <w:i/>
         </w:rPr>
-        <w:t xml:space="preserve"> </w:t>
-      </w:r>
-      <w:r>
-        <w:rPr>
-          <w:i/>
-        </w:rPr>
-        <w:t>(expected)</w:t>
+        <w:t xml:space="preserve"/>
+      </w:r>
+      <w:r>
+        <w:rPr>
+          <w:i/>
+        </w:rPr>
+        <w:t/>
       </w:r>
     </w:p>
     <w:p>
@@ -842,7 +842,7 @@
         <w:ind w:left="360"/>
       </w:pPr>
       <w:r>
-        <w:t>Georgia Tech Presidential Fellowship</w:t>
+        <w:t>Georgia Tech Presidential Fellowship (2026)</w:t>
       </w:r>
     </w:p>
     <w:p>
@@ -856,7 +856,7 @@
         <w:ind w:left="360"/>
       </w:pPr>
       <w:r>
-        <w:t>Computer Science Outstanding Student Teaching Award, Princeton University</w:t>
+        <w:t>Computer Science Outstanding Student Teaching Award, Princeton University (2025)</w:t>
       </w:r>
     </w:p>
     <w:p>
@@ -870,7 +870,7 @@
         <w:ind w:left="360"/>
       </w:pPr>
       <w:r>
-        <w:t>Outstanding Computer Science Research Prize, Princeton University</w:t>
+        <w:t>Outstanding Computer Science Research Prize, Princeton University (2025)</w:t>
       </w:r>
     </w:p>
     <w:p>
@@ -884,7 +884,7 @@
         <w:ind w:left="360"/>
       </w:pPr>
       <w:r>
-        <w:t>Computer Science Service Award, Princeton University</w:t>
+        <w:t>Computer Science Service Award, Princeton University (2025)</w:t>
       </w:r>
     </w:p>
     <w:p>
@@ -898,7 +898,7 @@
         <w:ind w:left="360"/>
       </w:pPr>
       <w:r>
-        <w:t>Highest Honors, Princeton Computer Science Department</w:t>
+        <w:t>Highest Honors, Princeton Computer Science Department (2025)</w:t>
       </w:r>
     </w:p>
     <w:p>

</xml_diff>

<commit_message>
Use Present for both graduate education date ranges
</commit_message>
<xml_diff>
--- a/CV/IjayNarangCV.docx
+++ b/CV/IjayNarangCV.docx
@@ -94,13 +94,13 @@
         <w:rPr>
           <w:i/>
         </w:rPr>
-        <w:t>202</w:t>
-      </w:r>
-      <w:r>
-        <w:rPr>
-          <w:i/>
-        </w:rPr>
-        <w:t>9</w:t>
+        <w:t>Present</w:t>
+      </w:r>
+      <w:r>
+        <w:rPr>
+          <w:i/>
+        </w:rPr>
+        <w:t/>
       </w:r>
     </w:p>
     <w:p>
@@ -149,13 +149,13 @@
         <w:rPr>
           <w:i/>
         </w:rPr>
-        <w:t>2025-202</w:t>
-      </w:r>
-      <w:r>
-        <w:rPr>
-          <w:i/>
-        </w:rPr>
-        <w:t>7</w:t>
+        <w:t>2025-Present</w:t>
+      </w:r>
+      <w:r>
+        <w:rPr>
+          <w:i/>
+        </w:rPr>
+        <w:t/>
       </w:r>
       <w:r>
         <w:rPr>

</xml_diff>

<commit_message>
Update CV publications and remove GlimpseBC submission label
</commit_message>
<xml_diff>
--- a/CV/IjayNarangCV.docx
+++ b/CV/IjayNarangCV.docx
@@ -374,31 +374,6 @@
         <w:rPr>
           <w:i/>
         </w:rPr>
-        <w:t xml:space="preserve">(Submitted to ICLR 2027) </w:t>
-      </w:r>
-      <w:r>
-        <w:rPr>
-          <w:b/>
-        </w:rPr>
-        <w:t>GlimpseBC: Learning Saccadic Visual Policies from Global View Demonstrations</w:t>
-      </w:r>
-      <w:r>
-        <w:t xml:space="preserve"> (with Jia Deng)</w:t>
-      </w:r>
-    </w:p>
-    <w:p>
-      <w:pPr>
-        <w:keepLines/>
-      </w:pPr>
-    </w:p>
-    <w:p>
-      <w:pPr>
-        <w:keepLines/>
-      </w:pPr>
-      <w:r>
-        <w:rPr>
-          <w:i/>
-        </w:rPr>
         <w:t xml:space="preserve">(Submitted to CPC) </w:t>
       </w:r>
       <w:r>
@@ -491,6 +466,39 @@
     </w:p>
     <w:p>
       <w:pPr>
+        <w:keepLines/>
+      </w:pPr>
+    </w:p>
+    <w:p>
+      <w:pPr>
+        <w:keepLines/>
+      </w:pPr>
+      <w:r>
+        <w:rPr>
+          <w:i/>
+        </w:rPr>
+        <w:t xml:space="preserve">(Preprint) </w:t>
+      </w:r>
+      <w:r>
+        <w:rPr>
+          <w:b/>
+        </w:rPr>
+        <w:t>Schrijver Number Quasi-Tensorization and Multicolor Ramsey Bounds via Robust OR Polynomials</w:t>
+      </w:r>
+      <w:r>
+        <w:t xml:space="preserve"> (with Yukai Tang) </w:t>
+      </w:r>
+      <w:hyperlink r:id="rId17" w:history="1">
+        <w:r>
+          <w:rPr>
+            <w:rStyle w:val="Hyperlink"/>
+          </w:rPr>
+          <w:t>[View Paper Here]</w:t>
+        </w:r>
+      </w:hyperlink>
+    </w:p>
+    <w:p>
+      <w:pPr>
         <w:keepNext/>
         <w:pBdr>
           <w:bottom w:val="single" w:sz="4" w:space="0" w:color="000000"/>
@@ -586,7 +594,7 @@
         </w:numPr>
       </w:pPr>
       <w:r>
-        <w:t>Developed GlimpseBC, a behavioral cloning algorithm that learns saccadic visual policies from full-frame demonstrations under inference-time visual constraints. The resulting policies achieve competitive performance with full-frame baselines on RoboMimic and Push-T while substantially reducing computational cost.</w:t>
+        <w:t>Worked with Jia Deng to develop GlimpseBC, a behavioral cloning algorithm that learns saccadic visual policies from full-frame demonstrations under inference-time visual constraints. The resulting policies achieve competitive performance with full-frame baselines on RoboMimic and Push-T while substantially reducing computational cost.</w:t>
       </w:r>
     </w:p>
     <w:p>

</xml_diff>

<commit_message>
Refine GlimpseBC research paragraph
</commit_message>
<xml_diff>
--- a/CV/IjayNarangCV.docx
+++ b/CV/IjayNarangCV.docx
@@ -586,15 +586,10 @@
     </w:p>
     <w:p>
       <w:pPr>
-        <w:pStyle w:val="ListParagraph"/>
         <w:keepLines/>
-        <w:numPr>
-          <w:ilvl w:val="0"/>
-          <w:numId w:val="10"/>
-        </w:numPr>
-      </w:pPr>
-      <w:r>
-        <w:t>Worked with Jia Deng to develop GlimpseBC, a behavioral cloning algorithm that learns saccadic visual policies from full-frame demonstrations under inference-time visual constraints. The resulting policies achieve competitive performance with full-frame baselines on RoboMimic and Push-T while substantially reducing computational cost.</w:t>
+      </w:pPr>
+      <w:r>
+        <w:t>Worked with Jia Deng on GlimpseBC, a behavioral cloning algorithm that learns saccadic visual policies from full-frame demonstrations under inference-time visual constraints. The resulting policies achieve competitive performance with full-frame baselines on RoboMimic and Push-T while substantially reducing computational cost. Paper in progress.</w:t>
       </w:r>
     </w:p>
     <w:p>

</xml_diff>

<commit_message>
Save revised CV and regenerate matching PDF
</commit_message>
<xml_diff>
--- a/CV/IjayNarangCV.docx
+++ b/CV/IjayNarangCV.docx
@@ -96,12 +96,6 @@
         </w:rPr>
         <w:t>Present</w:t>
       </w:r>
-      <w:r>
-        <w:rPr>
-          <w:i/>
-        </w:rPr>
-        <w:t/>
-      </w:r>
     </w:p>
     <w:p>
       <w:pPr>
@@ -140,34 +134,10 @@
         <w:tab/>
       </w:r>
       <w:r>
-        <w:t xml:space="preserve"/>
-      </w:r>
-      <w:r>
-        <w:t xml:space="preserve"/>
-      </w:r>
-      <w:r>
         <w:rPr>
           <w:i/>
         </w:rPr>
         <w:t>2025-Present</w:t>
-      </w:r>
-      <w:r>
-        <w:rPr>
-          <w:i/>
-        </w:rPr>
-        <w:t/>
-      </w:r>
-      <w:r>
-        <w:rPr>
-          <w:i/>
-        </w:rPr>
-        <w:t xml:space="preserve"/>
-      </w:r>
-      <w:r>
-        <w:rPr>
-          <w:i/>
-        </w:rPr>
-        <w:t/>
       </w:r>
     </w:p>
     <w:p>
@@ -304,21 +274,7 @@
         <w:rPr>
           <w:b/>
         </w:rPr>
-        <w:t>Steady-State Behavior of Constant-</w:t>
-      </w:r>
-      <w:proofErr w:type="spellStart"/>
-      <w:r>
-        <w:rPr>
-          <w:b/>
-        </w:rPr>
-        <w:t>Stepsize</w:t>
-      </w:r>
-      <w:proofErr w:type="spellEnd"/>
-      <w:r>
-        <w:rPr>
-          <w:b/>
-        </w:rPr>
-        <w:t xml:space="preserve"> Stochastic Approximation: Gaussian Approximation and Tail Bounds</w:t>
+        <w:t>Steady-State Behavior of Constant-Stepsize Stochastic Approximation: Gaussian Approximation and Tail Bounds</w:t>
       </w:r>
       <w:r>
         <w:t xml:space="preserve"> (with Zedong Wang, Yuyang Wang, Felix Wang, Yuzhou Wang, and Siva Theja Maguluri) </w:t>
@@ -442,16 +398,8 @@
         <w:rPr>
           <w:b/>
         </w:rPr>
-        <w:t xml:space="preserve">The Hard-Core Model on Bipartite Spectral Expanders: Counting and Sampling at All </w:t>
-      </w:r>
-      <w:proofErr w:type="spellStart"/>
-      <w:r>
-        <w:rPr>
-          <w:b/>
-        </w:rPr>
-        <w:t>Fugacities</w:t>
-      </w:r>
-      <w:proofErr w:type="spellEnd"/>
+        <w:t>The Hard-Core Model on Bipartite Spectral Expanders: Counting and Sampling at All Fugacities</w:t>
+      </w:r>
       <w:r>
         <w:t xml:space="preserve"> (with Will Perkins) </w:t>
       </w:r>
@@ -471,24 +419,54 @@
     </w:p>
     <w:p>
       <w:pPr>
-        <w:keepLines/>
-      </w:pPr>
-      <w:r>
-        <w:rPr>
-          <w:i/>
-        </w:rPr>
-        <w:t xml:space="preserve">(Preprint) </w:t>
-      </w:r>
-      <w:r>
-        <w:rPr>
-          <w:b/>
-        </w:rPr>
-        <w:t>Schrijver Number Quasi-Tensorization and Multicolor Ramsey Bounds via Robust OR Polynomials</w:t>
-      </w:r>
-      <w:r>
-        <w:t xml:space="preserve"> (with Yukai Tang) </w:t>
-      </w:r>
-      <w:hyperlink r:id="rId17" w:history="1">
+        <w:rPr>
+          <w:b/>
+          <w:bCs/>
+          <w:i/>
+        </w:rPr>
+      </w:pPr>
+      <w:r>
+        <w:rPr>
+          <w:i/>
+        </w:rPr>
+        <w:t>(</w:t>
+      </w:r>
+      <w:r>
+        <w:rPr>
+          <w:i/>
+        </w:rPr>
+        <w:t>Manuscript</w:t>
+      </w:r>
+      <w:r>
+        <w:rPr>
+          <w:i/>
+        </w:rPr>
+        <w:t xml:space="preserve">) </w:t>
+      </w:r>
+      <w:r>
+        <w:rPr>
+          <w:b/>
+        </w:rPr>
+        <w:t>On even-H-free Colorings</w:t>
+      </w:r>
+      <w:r>
+        <w:rPr>
+          <w:b/>
+          <w:bCs/>
+          <w:i/>
+        </w:rPr>
+        <w:t xml:space="preserve"> </w:t>
+      </w:r>
+      <w:r>
+        <w:t xml:space="preserve">(with </w:t>
+      </w:r>
+      <w:r>
+        <w:t>Noga Alon</w:t>
+      </w:r>
+      <w:r>
+        <w:t xml:space="preserve">) </w:t>
+      </w:r>
+      <w:hyperlink r:id="rId14" w:history="1">
         <w:r>
           <w:rPr>
             <w:rStyle w:val="Hyperlink"/>
@@ -586,10 +564,15 @@
     </w:p>
     <w:p>
       <w:pPr>
+        <w:pStyle w:val="ListParagraph"/>
         <w:keepLines/>
-      </w:pPr>
-      <w:r>
-        <w:t>Worked with Jia Deng on GlimpseBC, a behavioral cloning algorithm that learns saccadic visual policies from full-frame demonstrations under inference-time visual constraints. The resulting policies achieve competitive performance with full-frame baselines on RoboMimic and Push-T while substantially reducing computational cost. Paper in progress.</w:t>
+        <w:numPr>
+          <w:ilvl w:val="0"/>
+          <w:numId w:val="10"/>
+        </w:numPr>
+      </w:pPr>
+      <w:r>
+        <w:t>Worked with Jia Deng on GlimpseBC, a behavioral cloning algorithm that learns saccadic visual policies from full-frame demonstrations. The resulting policies achieve competitive performance with full-frame baselines on RoboMimic and Push-T while reducing computational cost. Paper in progress.</w:t>
       </w:r>
     </w:p>
     <w:p>
@@ -915,10 +898,42 @@
         <w:ind w:left="360"/>
       </w:pPr>
       <w:r>
-        <w:t>U.S. Presidential Scholar</w:t>
-      </w:r>
-      <w:r>
-        <w:t xml:space="preserve"> (</w:t>
+        <w:t>4</w:t>
+      </w:r>
+      <w:r>
+        <w:rPr>
+          <w:vertAlign w:val="superscript"/>
+        </w:rPr>
+        <w:t>th</w:t>
+      </w:r>
+      <w:r>
+        <w:t xml:space="preserve"> Place</w:t>
+      </w:r>
+      <w:r>
+        <w:t xml:space="preserve"> at ICPC</w:t>
+      </w:r>
+      <w:r>
+        <w:t xml:space="preserve"> </w:t>
+      </w:r>
+      <w:r>
+        <w:t>Greater New York Regional Competition</w:t>
+      </w:r>
+      <w:r>
+        <w:t xml:space="preserve"> (2023)</w:t>
+      </w:r>
+    </w:p>
+    <w:p>
+      <w:pPr>
+        <w:pStyle w:val="ListParagraph"/>
+        <w:keepLines/>
+        <w:numPr>
+          <w:ilvl w:val="0"/>
+          <w:numId w:val="2"/>
+        </w:numPr>
+        <w:ind w:left="360"/>
+      </w:pPr>
+      <w:r>
+        <w:t>U.S. Presidential Scholar (</w:t>
       </w:r>
       <w:r>
         <w:t>2021</w:t>
@@ -989,13 +1004,8 @@
       <w:r>
         <w:t xml:space="preserve"> </w:t>
       </w:r>
-      <w:proofErr w:type="spellStart"/>
-      <w:r>
-        <w:t>PyTorch</w:t>
-      </w:r>
-      <w:proofErr w:type="spellEnd"/>
-      <w:r>
-        <w:t xml:space="preserve">, NumPy, SciPy, </w:t>
+      <w:r>
+        <w:t xml:space="preserve">PyTorch, NumPy, SciPy, </w:t>
       </w:r>
       <w:r>
         <w:t>p</w:t>
@@ -1030,7 +1040,7 @@
       <w:r>
         <w:t xml:space="preserve"> all-in-one Princeton University course-planning app, now used by 700+ students and maintained by Hoagie Club as Hoagie Plan. </w:t>
       </w:r>
-      <w:hyperlink r:id="rId14" w:history="1">
+      <w:hyperlink r:id="rId15" w:history="1">
         <w:r>
           <w:rPr>
             <w:rStyle w:val="Hyperlink"/>

</xml_diff>

<commit_message>
Update resume master's education and GPA
</commit_message>
<xml_diff>
--- a/CV/IjayNarangCV.docx
+++ b/CV/IjayNarangCV.docx
@@ -79,6 +79,9 @@
         <w:t>Georgia Institute of Technology | Atlanta, GA</w:t>
       </w:r>
       <w:r>
+        <w:t xml:space="preserve"> | GPA 3.9/4.0</w:t>
+      </w:r>
+      <w:r>
         <w:rPr>
           <w:b/>
         </w:rPr>
@@ -95,25 +98,6 @@
           <w:i/>
         </w:rPr>
         <w:t>Present</w:t>
-      </w:r>
-    </w:p>
-    <w:p>
-      <w:pPr>
-        <w:pStyle w:val="ListParagraph"/>
-        <w:keepLines/>
-        <w:numPr>
-          <w:ilvl w:val="0"/>
-          <w:numId w:val="10"/>
-        </w:numPr>
-      </w:pPr>
-      <w:r>
-        <w:t xml:space="preserve">Ph.D. </w:t>
-      </w:r>
-      <w:r>
-        <w:t>Student</w:t>
-      </w:r>
-      <w:r>
-        <w:t xml:space="preserve"> in Computer Science</w:t>
       </w:r>
     </w:p>
     <w:p>
@@ -129,15 +113,6 @@
       </w:pPr>
       <w:r>
         <w:t>M.S. in Machine Learning</w:t>
-      </w:r>
-      <w:r>
-        <w:tab/>
-      </w:r>
-      <w:r>
-        <w:rPr>
-          <w:i/>
-        </w:rPr>
-        <w:t>2025-2027</w:t>
       </w:r>
     </w:p>
     <w:p>

</xml_diff>